<commit_message>
update gap analysis: blueprints, validation
</commit_message>
<xml_diff>
--- a/ContinuationProject/DISC_DEXPI_GapAnalysis.docx
+++ b/ContinuationProject/DISC_DEXPI_GapAnalysis.docx
@@ -2549,9 +2549,9 @@
         </w:sectPr>
       </w:pPr>
     </w:p>
-    <w:bookmarkStart w:id="0" w:name="_bookmark0" w:displacedByCustomXml="next"/>
+    <w:bookmarkStart w:id="0" w:name="_bookmark1" w:displacedByCustomXml="next"/>
     <w:bookmarkEnd w:id="0" w:displacedByCustomXml="next"/>
-    <w:bookmarkStart w:id="1" w:name="_bookmark1" w:displacedByCustomXml="next"/>
+    <w:bookmarkStart w:id="1" w:name="_bookmark0" w:displacedByCustomXml="next"/>
     <w:bookmarkEnd w:id="1" w:displacedByCustomXml="next"/>
     <w:sdt>
       <w:sdtPr>
@@ -2584,7 +2584,7 @@
         </w:p>
         <w:p>
           <w:pPr>
-            <w:pStyle w:val="TOC1"/>
+            <w:pStyle w:val="Verzeichnis1"/>
             <w:tabs>
               <w:tab w:val="right" w:leader="dot" w:pos="10390"/>
             </w:tabs>
@@ -2686,7 +2686,7 @@
         </w:p>
         <w:p>
           <w:pPr>
-            <w:pStyle w:val="TOC1"/>
+            <w:pStyle w:val="Verzeichnis1"/>
             <w:tabs>
               <w:tab w:val="right" w:leader="dot" w:pos="10390"/>
             </w:tabs>
@@ -2779,7 +2779,7 @@
         </w:p>
         <w:p>
           <w:pPr>
-            <w:pStyle w:val="TOC1"/>
+            <w:pStyle w:val="Verzeichnis1"/>
             <w:tabs>
               <w:tab w:val="right" w:leader="dot" w:pos="10390"/>
             </w:tabs>
@@ -2872,7 +2872,7 @@
         </w:p>
         <w:p>
           <w:pPr>
-            <w:pStyle w:val="TOC2"/>
+            <w:pStyle w:val="Verzeichnis2"/>
             <w:tabs>
               <w:tab w:val="right" w:leader="dot" w:pos="10390"/>
             </w:tabs>
@@ -2965,7 +2965,7 @@
         </w:p>
         <w:p>
           <w:pPr>
-            <w:pStyle w:val="TOC2"/>
+            <w:pStyle w:val="Verzeichnis2"/>
             <w:tabs>
               <w:tab w:val="right" w:leader="dot" w:pos="10390"/>
             </w:tabs>
@@ -3058,7 +3058,7 @@
         </w:p>
         <w:p>
           <w:pPr>
-            <w:pStyle w:val="TOC2"/>
+            <w:pStyle w:val="Verzeichnis2"/>
             <w:tabs>
               <w:tab w:val="right" w:leader="dot" w:pos="10390"/>
             </w:tabs>
@@ -3151,7 +3151,7 @@
         </w:p>
         <w:p>
           <w:pPr>
-            <w:pStyle w:val="TOC2"/>
+            <w:pStyle w:val="Verzeichnis2"/>
             <w:tabs>
               <w:tab w:val="right" w:leader="dot" w:pos="10390"/>
             </w:tabs>
@@ -3244,7 +3244,7 @@
         </w:p>
         <w:p>
           <w:pPr>
-            <w:pStyle w:val="TOC2"/>
+            <w:pStyle w:val="Verzeichnis2"/>
             <w:tabs>
               <w:tab w:val="right" w:leader="dot" w:pos="10390"/>
             </w:tabs>
@@ -3337,7 +3337,7 @@
         </w:p>
         <w:p>
           <w:pPr>
-            <w:pStyle w:val="TOC2"/>
+            <w:pStyle w:val="Verzeichnis2"/>
             <w:tabs>
               <w:tab w:val="right" w:leader="dot" w:pos="10390"/>
             </w:tabs>
@@ -3430,7 +3430,7 @@
         </w:p>
         <w:p>
           <w:pPr>
-            <w:pStyle w:val="TOC2"/>
+            <w:pStyle w:val="Verzeichnis2"/>
             <w:tabs>
               <w:tab w:val="right" w:leader="dot" w:pos="10390"/>
             </w:tabs>
@@ -3523,7 +3523,7 @@
         </w:p>
         <w:p>
           <w:pPr>
-            <w:pStyle w:val="TOC2"/>
+            <w:pStyle w:val="Verzeichnis2"/>
             <w:tabs>
               <w:tab w:val="right" w:leader="dot" w:pos="10390"/>
             </w:tabs>
@@ -3616,7 +3616,7 @@
         </w:p>
         <w:p>
           <w:pPr>
-            <w:pStyle w:val="TOC2"/>
+            <w:pStyle w:val="Verzeichnis2"/>
             <w:tabs>
               <w:tab w:val="right" w:leader="dot" w:pos="10390"/>
             </w:tabs>
@@ -3709,7 +3709,7 @@
         </w:p>
         <w:p>
           <w:pPr>
-            <w:pStyle w:val="TOC2"/>
+            <w:pStyle w:val="Verzeichnis2"/>
             <w:tabs>
               <w:tab w:val="right" w:leader="dot" w:pos="10390"/>
             </w:tabs>
@@ -3802,7 +3802,7 @@
         </w:p>
         <w:p>
           <w:pPr>
-            <w:pStyle w:val="TOC2"/>
+            <w:pStyle w:val="Verzeichnis2"/>
             <w:tabs>
               <w:tab w:val="right" w:leader="dot" w:pos="10390"/>
             </w:tabs>
@@ -3895,7 +3895,7 @@
         </w:p>
         <w:p>
           <w:pPr>
-            <w:pStyle w:val="TOC2"/>
+            <w:pStyle w:val="Verzeichnis2"/>
             <w:tabs>
               <w:tab w:val="right" w:leader="dot" w:pos="10390"/>
             </w:tabs>
@@ -3988,7 +3988,7 @@
         </w:p>
         <w:p>
           <w:pPr>
-            <w:pStyle w:val="TOC2"/>
+            <w:pStyle w:val="Verzeichnis2"/>
             <w:tabs>
               <w:tab w:val="right" w:leader="dot" w:pos="10390"/>
             </w:tabs>
@@ -4081,7 +4081,7 @@
         </w:p>
         <w:p>
           <w:pPr>
-            <w:pStyle w:val="TOC1"/>
+            <w:pStyle w:val="Verzeichnis1"/>
             <w:tabs>
               <w:tab w:val="right" w:leader="dot" w:pos="10390"/>
             </w:tabs>
@@ -4359,21 +4359,7 @@
               <w:rPr>
                 <w:spacing w:val="-2"/>
               </w:rPr>
-              <w:t xml:space="preserve">between Equinor, AkerBP, Aibel &amp; </w:t>
-            </w:r>
-            <w:proofErr w:type="spellStart"/>
-            <w:r>
-              <w:rPr>
-                <w:spacing w:val="-2"/>
-              </w:rPr>
-              <w:t>AkerSolutions</w:t>
-            </w:r>
-            <w:proofErr w:type="spellEnd"/>
-            <w:r>
-              <w:rPr>
-                <w:spacing w:val="-2"/>
-              </w:rPr>
-              <w:t>.</w:t>
+              <w:t>between Equinor, AkerBP, Aibel &amp; AkerSolutions.</w:t>
             </w:r>
           </w:p>
         </w:tc>
@@ -4754,7 +4740,6 @@
               </w:rPr>
             </w:pPr>
             <w:hyperlink r:id="rId14" w:history="1">
-              <w:proofErr w:type="spellStart"/>
               <w:r>
                 <w:rPr>
                   <w:rStyle w:val="Hyperlink"/>
@@ -4762,7 +4747,6 @@
                 </w:rPr>
                 <w:t>pnb</w:t>
               </w:r>
-              <w:proofErr w:type="spellEnd"/>
             </w:hyperlink>
           </w:p>
         </w:tc>
@@ -4776,13 +4760,8 @@
               <w:spacing w:before="43"/>
               <w:ind w:left="285"/>
             </w:pPr>
-            <w:proofErr w:type="spellStart"/>
-            <w:r>
-              <w:t>pnb</w:t>
-            </w:r>
-            <w:proofErr w:type="spellEnd"/>
-            <w:r>
-              <w:t xml:space="preserve"> </w:t>
+            <w:r>
+              <w:t xml:space="preserve">pnb </w:t>
             </w:r>
             <w:r>
               <w:t>p</w:t>
@@ -4934,7 +4913,7 @@
     </w:p>
     <w:p>
       <w:pPr>
-        <w:pStyle w:val="Heading1"/>
+        <w:pStyle w:val="berschrift1"/>
       </w:pPr>
       <w:bookmarkStart w:id="2" w:name="_Toc206410167"/>
       <w:r>
@@ -4945,7 +4924,7 @@
     </w:p>
     <w:p>
       <w:pPr>
-        <w:pStyle w:val="BodyText"/>
+        <w:pStyle w:val="Textkrper"/>
         <w:rPr>
           <w:rFonts w:ascii="Times New Roman" w:eastAsia="Times New Roman" w:hAnsi="Times New Roman" w:cs="Times New Roman"/>
         </w:rPr>
@@ -4956,7 +4935,7 @@
     </w:p>
     <w:p>
       <w:pPr>
-        <w:pStyle w:val="BodyText"/>
+        <w:pStyle w:val="Textkrper"/>
       </w:pPr>
       <w:r>
         <w:t>Prior to the current DISC DEXPI Continuation Project, the NOAKA DEXPI Project documents most of the requirements for DISC partners to implement DEXPI in a standardized way and addressed several gaps between the DISC requirements and the existing DEXPI specification.</w:t>
@@ -4964,7 +4943,7 @@
     </w:p>
     <w:p>
       <w:pPr>
-        <w:pStyle w:val="BodyText"/>
+        <w:pStyle w:val="Textkrper"/>
       </w:pPr>
       <w:r>
         <w:t>Building on this foundation, the current project aims to close the remaining gaps and address integration challenges between CAD vendors, with the ultimate objective of enabling full round-trip transfers of DEXPI P&amp;IDs. A number of these gaps can only be addressed now that the new DEXPI serialization format is approved, moving away from the Proteus schema. As a result, the solutions developed in this project and presented to the DEXPI content team for integration into the DEXPI model will be serializable exclusively using the new format.</w:t>
@@ -4972,7 +4951,7 @@
     </w:p>
     <w:p>
       <w:pPr>
-        <w:pStyle w:val="BodyText"/>
+        <w:pStyle w:val="Textkrper"/>
       </w:pPr>
       <w:r>
         <w:t>This document outlines the outstanding gaps identifie</w:t>
@@ -4989,7 +4968,7 @@
     </w:p>
     <w:p>
       <w:pPr>
-        <w:pStyle w:val="BodyText"/>
+        <w:pStyle w:val="Textkrper"/>
       </w:pPr>
       <w:r>
         <w:t xml:space="preserve">In the context of this document, ‘gaps’ refer to differences between the NCS P&amp;ID engineering modelling requirements and the DEXPI 2.0 standard, </w:t>
@@ -5003,7 +4982,7 @@
     </w:p>
     <w:p>
       <w:pPr>
-        <w:pStyle w:val="Heading1"/>
+        <w:pStyle w:val="berschrift1"/>
       </w:pPr>
       <w:bookmarkStart w:id="3" w:name="_Toc206410168"/>
       <w:r>
@@ -5013,7 +4992,7 @@
     </w:p>
     <w:p>
       <w:pPr>
-        <w:pStyle w:val="BodyText"/>
+        <w:pStyle w:val="Textkrper"/>
       </w:pPr>
       <w:r>
         <w:t>At the conclusion of the NOAKA/DISC DEXPI project, several engineering elements remained either undocumented in the DISC DEXPI Requirements document and/or unmodelled</w:t>
@@ -5036,7 +5015,7 @@
     </w:p>
     <w:p>
       <w:pPr>
-        <w:pStyle w:val="BodyText"/>
+        <w:pStyle w:val="Textkrper"/>
       </w:pPr>
       <w:r>
         <w:t>Each of these gaps will be addressed in this project and where relevant include in extensions of the blueprint files ma</w:t>
@@ -5050,7 +5029,7 @@
     </w:p>
     <w:p>
       <w:pPr>
-        <w:pStyle w:val="BodyText"/>
+        <w:pStyle w:val="Textkrper"/>
       </w:pPr>
       <w:r>
         <w:t>The blueprint files will be provided in both the old Proteus schema and the new DEXPI XML format where possible.</w:t>
@@ -5058,7 +5037,7 @@
     </w:p>
     <w:p>
       <w:pPr>
-        <w:pStyle w:val="BodyText"/>
+        <w:pStyle w:val="Textkrper"/>
       </w:pPr>
       <w:r>
         <w:t>Some solutions will only be feasible using the new DEXPI 2.0 serialization, where</w:t>
@@ -5078,7 +5057,7 @@
     </w:p>
     <w:p>
       <w:pPr>
-        <w:pStyle w:val="Heading1"/>
+        <w:pStyle w:val="berschrift1"/>
       </w:pPr>
       <w:bookmarkStart w:id="4" w:name="_Toc206410169"/>
       <w:r>
@@ -5088,7 +5067,7 @@
     </w:p>
     <w:p>
       <w:pPr>
-        <w:pStyle w:val="BodyText"/>
+        <w:pStyle w:val="Textkrper"/>
         <w:rPr>
           <w:lang w:val="en-US"/>
         </w:rPr>
@@ -5111,7 +5090,7 @@
     </w:p>
     <w:p>
       <w:pPr>
-        <w:pStyle w:val="Heading2"/>
+        <w:pStyle w:val="berschrift2"/>
       </w:pPr>
       <w:bookmarkStart w:id="5" w:name="_Toc206410170"/>
       <w:r>
@@ -5121,7 +5100,7 @@
     </w:p>
     <w:p>
       <w:pPr>
-        <w:pStyle w:val="BodyText"/>
+        <w:pStyle w:val="Textkrper"/>
       </w:pPr>
       <w:r>
         <w:t xml:space="preserve">In the NOAKA/DISC DEXPI project, a simplified and pragmatic approach </w:t>
@@ -5136,39 +5115,7 @@
         <w:t>adopted</w:t>
       </w:r>
       <w:r>
-        <w:t xml:space="preserve"> for modelling instrumentation and automation elements, avoiding the use of the full DEXPI instrumentation models for </w:t>
-      </w:r>
-      <w:proofErr w:type="spellStart"/>
-      <w:r>
-        <w:t>ProcessSignalGeneratingFunction</w:t>
-      </w:r>
-      <w:proofErr w:type="spellEnd"/>
-      <w:r>
-        <w:t xml:space="preserve"> / </w:t>
-      </w:r>
-      <w:proofErr w:type="spellStart"/>
-      <w:r>
-        <w:t>MeasuringSystem</w:t>
-      </w:r>
-      <w:proofErr w:type="spellEnd"/>
-      <w:r>
-        <w:t xml:space="preserve"> and </w:t>
-      </w:r>
-      <w:proofErr w:type="spellStart"/>
-      <w:r>
-        <w:t>ActuatingElectricalFunction</w:t>
-      </w:r>
-      <w:proofErr w:type="spellEnd"/>
-      <w:r>
-        <w:t xml:space="preserve"> / </w:t>
-      </w:r>
-      <w:proofErr w:type="spellStart"/>
-      <w:r>
-        <w:t>ActuatingElectricalSystem</w:t>
-      </w:r>
-      <w:proofErr w:type="spellEnd"/>
-      <w:r>
-        <w:t xml:space="preserve"> with their associated sub-component class types.</w:t>
+        <w:t xml:space="preserve"> for modelling instrumentation and automation elements, avoiding the use of the full DEXPI instrumentation models for ProcessSignalGeneratingFunction / MeasuringSystem and ActuatingElectricalFunction / ActuatingElectricalSystem with their associated sub-component class types.</w:t>
       </w:r>
       <w:r>
         <w:t xml:space="preserve"> T</w:t>
@@ -5178,20 +5125,12 @@
       </w:r>
       <w:r>
         <w:lastRenderedPageBreak/>
-        <w:t xml:space="preserve">simplified approach classified all elements within these modelling branches under the </w:t>
-      </w:r>
-      <w:proofErr w:type="spellStart"/>
-      <w:r>
-        <w:t>ProcessInstrumentationFunction</w:t>
-      </w:r>
-      <w:proofErr w:type="spellEnd"/>
-      <w:r>
-        <w:t xml:space="preserve"> class type, with differentiation achieved through type attributes.</w:t>
-      </w:r>
-    </w:p>
-    <w:p>
-      <w:pPr>
-        <w:pStyle w:val="BodyText"/>
+        <w:t>simplified approach classified all elements within these modelling branches under the ProcessInstrumentationFunction class type, with differentiation achieved through type attributes.</w:t>
+      </w:r>
+    </w:p>
+    <w:p>
+      <w:pPr>
+        <w:pStyle w:val="Textkrper"/>
         <w:rPr>
           <w:b/>
           <w:bCs/>
@@ -5221,7 +5160,7 @@
     </w:p>
     <w:p>
       <w:pPr>
-        <w:pStyle w:val="BodyText"/>
+        <w:pStyle w:val="Textkrper"/>
       </w:pPr>
       <w:r>
         <w:t xml:space="preserve">During the period between the original DISC DEXPI project and this continuation project, significant effort </w:t>
@@ -5259,7 +5198,7 @@
     </w:p>
     <w:p>
       <w:pPr>
-        <w:pStyle w:val="BodyText"/>
+        <w:pStyle w:val="Textkrper"/>
       </w:pPr>
       <w:r>
         <w:t>Note: The simplified approach is also more easily applied to legacy DEXPI drawing conversion from image or unintelligent CAD tools.</w:t>
@@ -5267,7 +5206,7 @@
     </w:p>
     <w:p>
       <w:pPr>
-        <w:pStyle w:val="BodyText"/>
+        <w:pStyle w:val="Textkrper"/>
       </w:pPr>
       <w:r>
         <w:t>Gap: This ‘gap’ can be considered closed.</w:t>
@@ -5275,7 +5214,7 @@
     </w:p>
     <w:p>
       <w:pPr>
-        <w:pStyle w:val="Heading2"/>
+        <w:pStyle w:val="berschrift2"/>
       </w:pPr>
       <w:bookmarkStart w:id="6" w:name="_Toc206410171"/>
       <w:r>
@@ -5285,7 +5224,7 @@
     </w:p>
     <w:p>
       <w:pPr>
-        <w:pStyle w:val="BodyText"/>
+        <w:pStyle w:val="Textkrper"/>
       </w:pPr>
       <w:r>
         <w:t xml:space="preserve">In the DISC project, a decision </w:t>
@@ -5311,7 +5250,7 @@
     </w:p>
     <w:p>
       <w:pPr>
-        <w:pStyle w:val="BodyText"/>
+        <w:pStyle w:val="Textkrper"/>
       </w:pPr>
       <w:r>
         <w:rPr>
@@ -5361,21 +5300,16 @@
     </w:p>
     <w:p>
       <w:pPr>
-        <w:pStyle w:val="Caption"/>
-      </w:pPr>
-      <w:proofErr w:type="gramStart"/>
-      <w:r>
-        <w:t>Figure :</w:t>
-      </w:r>
-      <w:proofErr w:type="gramEnd"/>
-      <w:r>
-        <w:t xml:space="preserve"> Example of Vessel/Tank Internal Components.</w:t>
+        <w:pStyle w:val="Beschriftung"/>
+      </w:pPr>
+      <w:r>
+        <w:t>Figure : Example of Vessel/Tank Internal Components.</w:t>
       </w:r>
     </w:p>
     <w:p/>
     <w:p>
       <w:pPr>
-        <w:pStyle w:val="BodyText"/>
+        <w:pStyle w:val="Textkrper"/>
       </w:pPr>
       <w:r>
         <w:t>Gap:</w:t>
@@ -5383,7 +5317,7 @@
     </w:p>
     <w:p>
       <w:pPr>
-        <w:pStyle w:val="BodyText"/>
+        <w:pStyle w:val="Textkrper"/>
         <w:numPr>
           <w:ilvl w:val="0"/>
           <w:numId w:val="20"/>
@@ -5395,24 +5329,19 @@
     </w:p>
     <w:p>
       <w:pPr>
-        <w:pStyle w:val="BodyText"/>
+        <w:pStyle w:val="Textkrper"/>
         <w:numPr>
           <w:ilvl w:val="0"/>
           <w:numId w:val="20"/>
         </w:numPr>
       </w:pPr>
-      <w:proofErr w:type="gramStart"/>
-      <w:r>
-        <w:t>.Include</w:t>
-      </w:r>
-      <w:proofErr w:type="gramEnd"/>
-      <w:r>
-        <w:t xml:space="preserve"> updates in DISC DEXPI Requirements document</w:t>
-      </w:r>
-    </w:p>
-    <w:p>
-      <w:pPr>
-        <w:pStyle w:val="BodyText"/>
+      <w:r>
+        <w:t>.Include updates in DISC DEXPI Requirements document</w:t>
+      </w:r>
+    </w:p>
+    <w:p>
+      <w:pPr>
+        <w:pStyle w:val="Textkrper"/>
         <w:numPr>
           <w:ilvl w:val="0"/>
           <w:numId w:val="20"/>
@@ -5425,7 +5354,7 @@
     </w:p>
     <w:p>
       <w:pPr>
-        <w:pStyle w:val="BodyText"/>
+        <w:pStyle w:val="Textkrper"/>
         <w:numPr>
           <w:ilvl w:val="0"/>
           <w:numId w:val="20"/>
@@ -5437,7 +5366,7 @@
     </w:p>
     <w:p>
       <w:pPr>
-        <w:pStyle w:val="Heading2"/>
+        <w:pStyle w:val="berschrift2"/>
       </w:pPr>
       <w:bookmarkStart w:id="7" w:name="_Toc206410172"/>
       <w:r>
@@ -5447,7 +5376,7 @@
     </w:p>
     <w:p>
       <w:pPr>
-        <w:pStyle w:val="BodyText"/>
+        <w:pStyle w:val="Textkrper"/>
       </w:pPr>
       <w:r>
         <w:t xml:space="preserve">Annotations (Note) class DISC proposal is part of the DEXPI standard but has not been </w:t>
@@ -5461,7 +5390,7 @@
     </w:p>
     <w:p>
       <w:pPr>
-        <w:pStyle w:val="BodyText"/>
+        <w:pStyle w:val="Textkrper"/>
       </w:pPr>
       <w:r>
         <w:t>This class supports note reference, text and association to other DEXPI conceptual objects.</w:t>
@@ -5469,7 +5398,7 @@
     </w:p>
     <w:p>
       <w:pPr>
-        <w:pStyle w:val="BodyText"/>
+        <w:pStyle w:val="Textkrper"/>
         <w:keepNext/>
       </w:pPr>
       <w:r>
@@ -5529,20 +5458,15 @@
     </w:p>
     <w:p>
       <w:pPr>
-        <w:pStyle w:val="Caption"/>
-      </w:pPr>
-      <w:proofErr w:type="gramStart"/>
-      <w:r>
-        <w:t>Figure :</w:t>
-      </w:r>
-      <w:proofErr w:type="gramEnd"/>
-      <w:r>
-        <w:t xml:space="preserve"> DEXPI Note class</w:t>
-      </w:r>
-    </w:p>
-    <w:p>
-      <w:pPr>
-        <w:pStyle w:val="BodyText"/>
+        <w:pStyle w:val="Beschriftung"/>
+      </w:pPr>
+      <w:r>
+        <w:t>Figure : DEXPI Note class</w:t>
+      </w:r>
+    </w:p>
+    <w:p>
+      <w:pPr>
+        <w:pStyle w:val="Textkrper"/>
       </w:pPr>
       <w:r>
         <w:t>Gap:</w:t>
@@ -5550,7 +5474,7 @@
     </w:p>
     <w:p>
       <w:pPr>
-        <w:pStyle w:val="BodyText"/>
+        <w:pStyle w:val="Textkrper"/>
         <w:numPr>
           <w:ilvl w:val="0"/>
           <w:numId w:val="20"/>
@@ -5562,7 +5486,7 @@
     </w:p>
     <w:p>
       <w:pPr>
-        <w:pStyle w:val="Heading2"/>
+        <w:pStyle w:val="berschrift2"/>
       </w:pPr>
       <w:bookmarkStart w:id="8" w:name="_Toc206410173"/>
       <w:r>
@@ -5572,7 +5496,7 @@
     </w:p>
     <w:p>
       <w:pPr>
-        <w:pStyle w:val="BodyText"/>
+        <w:pStyle w:val="Textkrper"/>
       </w:pPr>
       <w:r>
         <w:t xml:space="preserve">Mount class DISC proposal </w:t>
@@ -5586,23 +5510,15 @@
     </w:p>
     <w:p>
       <w:pPr>
-        <w:pStyle w:val="BodyText"/>
-      </w:pPr>
-      <w:r>
-        <w:t xml:space="preserve">This class supports the mounting connection between instrument and equipment type and can be assigned as a sensing location for the </w:t>
-      </w:r>
-      <w:proofErr w:type="spellStart"/>
-      <w:r>
-        <w:t>ProcessSignalGeneratingFunction</w:t>
-      </w:r>
-      <w:proofErr w:type="spellEnd"/>
-      <w:r>
-        <w:t>.</w:t>
-      </w:r>
-    </w:p>
-    <w:p>
-      <w:pPr>
-        <w:pStyle w:val="BodyText"/>
+        <w:pStyle w:val="Textkrper"/>
+      </w:pPr>
+      <w:r>
+        <w:t>This class supports the mounting connection between instrument and equipment type and can be assigned as a sensing location for the ProcessSignalGeneratingFunction.</w:t>
+      </w:r>
+    </w:p>
+    <w:p>
+      <w:pPr>
+        <w:pStyle w:val="Textkrper"/>
         <w:keepNext/>
       </w:pPr>
       <w:r>
@@ -5665,20 +5581,15 @@
     </w:p>
     <w:p>
       <w:pPr>
-        <w:pStyle w:val="Caption"/>
-      </w:pPr>
-      <w:proofErr w:type="gramStart"/>
-      <w:r>
-        <w:t>Figure :</w:t>
-      </w:r>
-      <w:proofErr w:type="gramEnd"/>
-      <w:r>
-        <w:t xml:space="preserve"> DEXPI Mount class</w:t>
-      </w:r>
-    </w:p>
-    <w:p>
-      <w:pPr>
-        <w:pStyle w:val="BodyText"/>
+        <w:pStyle w:val="Beschriftung"/>
+      </w:pPr>
+      <w:r>
+        <w:t>Figure : DEXPI Mount class</w:t>
+      </w:r>
+    </w:p>
+    <w:p>
+      <w:pPr>
+        <w:pStyle w:val="Textkrper"/>
       </w:pPr>
       <w:r>
         <w:t>Gap:</w:t>
@@ -5686,7 +5597,7 @@
     </w:p>
     <w:p>
       <w:pPr>
-        <w:pStyle w:val="BodyText"/>
+        <w:pStyle w:val="Textkrper"/>
         <w:numPr>
           <w:ilvl w:val="0"/>
           <w:numId w:val="20"/>
@@ -5698,7 +5609,7 @@
     </w:p>
     <w:p>
       <w:pPr>
-        <w:pStyle w:val="BodyText"/>
+        <w:pStyle w:val="Textkrper"/>
         <w:numPr>
           <w:ilvl w:val="0"/>
           <w:numId w:val="20"/>
@@ -5710,7 +5621,7 @@
     </w:p>
     <w:p>
       <w:pPr>
-        <w:pStyle w:val="BodyText"/>
+        <w:pStyle w:val="Textkrper"/>
         <w:numPr>
           <w:ilvl w:val="0"/>
           <w:numId w:val="20"/>
@@ -5722,7 +5633,7 @@
     </w:p>
     <w:p>
       <w:pPr>
-        <w:pStyle w:val="Heading2"/>
+        <w:pStyle w:val="berschrift2"/>
       </w:pPr>
       <w:bookmarkStart w:id="9" w:name="_Toc206410174"/>
       <w:r>
@@ -5733,7 +5644,7 @@
     </w:p>
     <w:p>
       <w:pPr>
-        <w:pStyle w:val="BodyText"/>
+        <w:pStyle w:val="Textkrper"/>
       </w:pPr>
       <w:r>
         <w:t xml:space="preserve">The following items have been </w:t>
@@ -5829,7 +5740,6 @@
                 <w:lang w:val="en-GB"/>
               </w:rPr>
             </w:pPr>
-            <w:proofErr w:type="spellStart"/>
             <w:r>
               <w:rPr>
                 <w:b/>
@@ -5840,7 +5750,6 @@
               </w:rPr>
               <w:t>ComponentClass</w:t>
             </w:r>
-            <w:proofErr w:type="spellEnd"/>
           </w:p>
         </w:tc>
         <w:tc>
@@ -5871,7 +5780,6 @@
                 <w:lang w:val="en-GB"/>
               </w:rPr>
             </w:pPr>
-            <w:proofErr w:type="spellStart"/>
             <w:r>
               <w:rPr>
                 <w:b/>
@@ -5882,7 +5790,6 @@
               </w:rPr>
               <w:t>ComponentClassURI</w:t>
             </w:r>
-            <w:proofErr w:type="spellEnd"/>
           </w:p>
         </w:tc>
         <w:tc>
@@ -5992,7 +5899,6 @@
                 <w:lang w:val="en-GB"/>
               </w:rPr>
             </w:pPr>
-            <w:proofErr w:type="spellStart"/>
             <w:r>
               <w:rPr>
                 <w:sz w:val="20"/>
@@ -6001,7 +5907,6 @@
               </w:rPr>
               <w:t>BlowerFan</w:t>
             </w:r>
-            <w:proofErr w:type="spellEnd"/>
           </w:p>
         </w:tc>
         <w:tc>
@@ -6145,7 +6050,6 @@
                 <w:lang w:val="en-GB"/>
               </w:rPr>
             </w:pPr>
-            <w:proofErr w:type="spellStart"/>
             <w:r>
               <w:rPr>
                 <w:sz w:val="20"/>
@@ -6154,7 +6058,6 @@
               </w:rPr>
               <w:t>BlowerFan</w:t>
             </w:r>
-            <w:proofErr w:type="spellEnd"/>
           </w:p>
         </w:tc>
         <w:tc>
@@ -6365,39 +6268,7 @@
                 <w:sz w:val="20"/>
                 <w:szCs w:val="20"/>
               </w:rPr>
-              <w:t xml:space="preserve">All the </w:t>
-            </w:r>
-            <w:proofErr w:type="spellStart"/>
-            <w:r>
-              <w:rPr>
-                <w:sz w:val="20"/>
-                <w:szCs w:val="20"/>
-              </w:rPr>
-              <w:t>PressureAbsoluteUnits</w:t>
-            </w:r>
-            <w:proofErr w:type="spellEnd"/>
-            <w:r>
-              <w:rPr>
-                <w:sz w:val="20"/>
-                <w:szCs w:val="20"/>
-              </w:rPr>
-              <w:t xml:space="preserve"> and </w:t>
-            </w:r>
-            <w:proofErr w:type="spellStart"/>
-            <w:r>
-              <w:rPr>
-                <w:sz w:val="20"/>
-                <w:szCs w:val="20"/>
-              </w:rPr>
-              <w:t>PressureGaugeUnits</w:t>
-            </w:r>
-            <w:proofErr w:type="spellEnd"/>
-            <w:r>
-              <w:rPr>
-                <w:sz w:val="20"/>
-                <w:szCs w:val="20"/>
-              </w:rPr>
-              <w:t xml:space="preserve"> have the same name and URI. The ga</w:t>
+              <w:t>All the PressureAbsoluteUnits and PressureGaugeUnits have the same name and URI. The ga</w:t>
             </w:r>
             <w:r>
               <w:rPr>
@@ -6594,7 +6465,7 @@
     </w:p>
     <w:p>
       <w:pPr>
-        <w:pStyle w:val="BodyText"/>
+        <w:pStyle w:val="Textkrper"/>
       </w:pPr>
       <w:r>
         <w:t>Gap:</w:t>
@@ -6602,7 +6473,7 @@
     </w:p>
     <w:p>
       <w:pPr>
-        <w:pStyle w:val="BodyText"/>
+        <w:pStyle w:val="Textkrper"/>
         <w:numPr>
           <w:ilvl w:val="0"/>
           <w:numId w:val="20"/>
@@ -6614,24 +6485,19 @@
     </w:p>
     <w:p>
       <w:pPr>
-        <w:pStyle w:val="BodyText"/>
+        <w:pStyle w:val="Textkrper"/>
         <w:numPr>
           <w:ilvl w:val="0"/>
           <w:numId w:val="20"/>
         </w:numPr>
       </w:pPr>
       <w:r>
-        <w:t>Check and if required raise issue with DEXPI group for UoM usage of bar/</w:t>
-      </w:r>
-      <w:proofErr w:type="spellStart"/>
-      <w:r>
-        <w:t>barg</w:t>
-      </w:r>
-      <w:proofErr w:type="spellEnd"/>
-    </w:p>
-    <w:p>
-      <w:pPr>
-        <w:pStyle w:val="Heading2"/>
+        <w:t>Check and if required raise issue with DEXPI group for UoM usage of bar/barg</w:t>
+      </w:r>
+    </w:p>
+    <w:p>
+      <w:pPr>
+        <w:pStyle w:val="berschrift2"/>
       </w:pPr>
       <w:bookmarkStart w:id="10" w:name="_Toc206410175"/>
       <w:r>
@@ -6641,7 +6507,7 @@
     </w:p>
     <w:p>
       <w:pPr>
-        <w:pStyle w:val="BodyText"/>
+        <w:pStyle w:val="Textkrper"/>
       </w:pPr>
       <w:r>
         <w:t xml:space="preserve">Current DEXPI conceptual model and serialization do not support the transfer of signal lines that run across multiple P&amp;IDs. In these cases, the current standard requires the use of ‘dummy’ elements to ensure the correct compositional topology in the transfer file – </w:t>
@@ -6655,7 +6521,7 @@
     </w:p>
     <w:p>
       <w:pPr>
-        <w:pStyle w:val="BodyText"/>
+        <w:pStyle w:val="Textkrper"/>
       </w:pPr>
       <w:r>
         <w:t>Gap:</w:t>
@@ -6663,7 +6529,7 @@
     </w:p>
     <w:p>
       <w:pPr>
-        <w:pStyle w:val="BodyText"/>
+        <w:pStyle w:val="Textkrper"/>
         <w:numPr>
           <w:ilvl w:val="0"/>
           <w:numId w:val="20"/>
@@ -6675,7 +6541,7 @@
     </w:p>
     <w:p>
       <w:pPr>
-        <w:pStyle w:val="BodyText"/>
+        <w:pStyle w:val="Textkrper"/>
         <w:numPr>
           <w:ilvl w:val="0"/>
           <w:numId w:val="20"/>
@@ -6687,7 +6553,7 @@
     </w:p>
     <w:p>
       <w:pPr>
-        <w:pStyle w:val="BodyText"/>
+        <w:pStyle w:val="Textkrper"/>
         <w:numPr>
           <w:ilvl w:val="0"/>
           <w:numId w:val="20"/>
@@ -6699,7 +6565,7 @@
     </w:p>
     <w:p>
       <w:pPr>
-        <w:pStyle w:val="BodyText"/>
+        <w:pStyle w:val="Textkrper"/>
         <w:numPr>
           <w:ilvl w:val="0"/>
           <w:numId w:val="20"/>
@@ -6711,7 +6577,7 @@
     </w:p>
     <w:p>
       <w:pPr>
-        <w:pStyle w:val="BodyText"/>
+        <w:pStyle w:val="Textkrper"/>
         <w:numPr>
           <w:ilvl w:val="0"/>
           <w:numId w:val="20"/>
@@ -6723,7 +6589,7 @@
     </w:p>
     <w:p>
       <w:pPr>
-        <w:pStyle w:val="Heading2"/>
+        <w:pStyle w:val="berschrift2"/>
       </w:pPr>
       <w:bookmarkStart w:id="11" w:name="_Toc206410176"/>
       <w:r>
@@ -6733,7 +6599,7 @@
     </w:p>
     <w:p>
       <w:pPr>
-        <w:pStyle w:val="BodyText"/>
+        <w:pStyle w:val="Textkrper"/>
       </w:pPr>
       <w:r>
         <w:t>Battery Limits define the boundary between plant owner responsibility and external entity responsibility. Tie-In Points defines the boundary between new and existing systems, defining the scope of a project.</w:t>
@@ -6741,7 +6607,7 @@
     </w:p>
     <w:p>
       <w:pPr>
-        <w:pStyle w:val="BodyText"/>
+        <w:pStyle w:val="Textkrper"/>
       </w:pPr>
       <w:r>
         <w:t xml:space="preserve">Transfer of Battery Limits and Tie-In Points is </w:t>
@@ -6755,7 +6621,7 @@
     </w:p>
     <w:p>
       <w:pPr>
-        <w:pStyle w:val="BodyText"/>
+        <w:pStyle w:val="Textkrper"/>
       </w:pPr>
       <w:r>
         <w:lastRenderedPageBreak/>
@@ -6764,7 +6630,7 @@
     </w:p>
     <w:p>
       <w:pPr>
-        <w:pStyle w:val="BodyText"/>
+        <w:pStyle w:val="Textkrper"/>
         <w:numPr>
           <w:ilvl w:val="0"/>
           <w:numId w:val="20"/>
@@ -6776,7 +6642,7 @@
     </w:p>
     <w:p>
       <w:pPr>
-        <w:pStyle w:val="BodyText"/>
+        <w:pStyle w:val="Textkrper"/>
         <w:numPr>
           <w:ilvl w:val="0"/>
           <w:numId w:val="20"/>
@@ -6788,7 +6654,7 @@
     </w:p>
     <w:p>
       <w:pPr>
-        <w:pStyle w:val="BodyText"/>
+        <w:pStyle w:val="Textkrper"/>
         <w:numPr>
           <w:ilvl w:val="0"/>
           <w:numId w:val="20"/>
@@ -6800,7 +6666,7 @@
     </w:p>
     <w:p>
       <w:pPr>
-        <w:pStyle w:val="BodyText"/>
+        <w:pStyle w:val="Textkrper"/>
         <w:numPr>
           <w:ilvl w:val="0"/>
           <w:numId w:val="20"/>
@@ -6812,7 +6678,7 @@
     </w:p>
     <w:p>
       <w:pPr>
-        <w:pStyle w:val="BodyText"/>
+        <w:pStyle w:val="Textkrper"/>
         <w:numPr>
           <w:ilvl w:val="0"/>
           <w:numId w:val="20"/>
@@ -6824,38 +6690,20 @@
     </w:p>
     <w:p>
       <w:pPr>
-        <w:pStyle w:val="Heading2"/>
+        <w:pStyle w:val="berschrift2"/>
       </w:pPr>
       <w:bookmarkStart w:id="12" w:name="_Toc206410177"/>
-      <w:proofErr w:type="spellStart"/>
-      <w:r>
-        <w:t>ProcessSafetyFunction</w:t>
-      </w:r>
-      <w:proofErr w:type="spellEnd"/>
-      <w:r>
-        <w:t xml:space="preserve"> Subtype</w:t>
+      <w:r>
+        <w:t>ProcessSafetyFunction Subtype</w:t>
       </w:r>
       <w:bookmarkEnd w:id="12"/>
     </w:p>
     <w:p>
       <w:pPr>
-        <w:pStyle w:val="BodyText"/>
-      </w:pPr>
-      <w:proofErr w:type="spellStart"/>
-      <w:r>
-        <w:t>ProcessSafetyFunction</w:t>
-      </w:r>
-      <w:proofErr w:type="spellEnd"/>
-      <w:r>
-        <w:t xml:space="preserve"> as a discrete subtype of </w:t>
-      </w:r>
-      <w:proofErr w:type="spellStart"/>
-      <w:r>
-        <w:t>ProcessInstrumentationFunction</w:t>
-      </w:r>
-      <w:proofErr w:type="spellEnd"/>
-      <w:r>
-        <w:t xml:space="preserve"> allows for improved modelling for safety critical elements directly from the DEXPI file/model</w:t>
+        <w:pStyle w:val="Textkrper"/>
+      </w:pPr>
+      <w:r>
+        <w:t>ProcessSafetyFunction as a discrete subtype of ProcessInstrumentationFunction allows for improved modelling for safety critical elements directly from the DEXPI file/model</w:t>
       </w:r>
       <w:r>
         <w:t>. The expectation is that this new subtype shall be identified as a separate class type.</w:t>
@@ -6863,7 +6711,7 @@
     </w:p>
     <w:p>
       <w:pPr>
-        <w:pStyle w:val="BodyText"/>
+        <w:pStyle w:val="Textkrper"/>
         <w:numPr>
           <w:ilvl w:val="0"/>
           <w:numId w:val="20"/>
@@ -6875,7 +6723,7 @@
     </w:p>
     <w:p>
       <w:pPr>
-        <w:pStyle w:val="BodyText"/>
+        <w:pStyle w:val="Textkrper"/>
         <w:numPr>
           <w:ilvl w:val="0"/>
           <w:numId w:val="20"/>
@@ -6887,7 +6735,7 @@
     </w:p>
     <w:p>
       <w:pPr>
-        <w:pStyle w:val="BodyText"/>
+        <w:pStyle w:val="Textkrper"/>
         <w:numPr>
           <w:ilvl w:val="0"/>
           <w:numId w:val="20"/>
@@ -6899,7 +6747,7 @@
     </w:p>
     <w:p>
       <w:pPr>
-        <w:pStyle w:val="BodyText"/>
+        <w:pStyle w:val="Textkrper"/>
         <w:numPr>
           <w:ilvl w:val="0"/>
           <w:numId w:val="20"/>
@@ -6911,7 +6759,7 @@
     </w:p>
     <w:p>
       <w:pPr>
-        <w:pStyle w:val="Heading2"/>
+        <w:pStyle w:val="berschrift2"/>
       </w:pPr>
       <w:bookmarkStart w:id="13" w:name="_Toc206410178"/>
       <w:r>
@@ -6921,37 +6769,21 @@
     </w:p>
     <w:p>
       <w:pPr>
-        <w:pStyle w:val="BodyText"/>
-      </w:pPr>
-      <w:r>
-        <w:t xml:space="preserve">Electrical Line additional type to support the electrical lines that are drafted on NCS P&amp;IDs. Within the current DISC DEXPI requirements/profile definition these are modelled as </w:t>
-      </w:r>
-      <w:proofErr w:type="spellStart"/>
-      <w:r>
-        <w:t>SignalConveryingFunction</w:t>
-      </w:r>
-      <w:proofErr w:type="spellEnd"/>
-      <w:r>
-        <w:t xml:space="preserve"> type. The expectation is that these electrical lines shall be </w:t>
+        <w:pStyle w:val="Textkrper"/>
+      </w:pPr>
+      <w:r>
+        <w:t xml:space="preserve">Electrical Line additional type to support the electrical lines that are drafted on NCS P&amp;IDs. Within the current DISC DEXPI requirements/profile definition these are modelled as SignalConveryingFunction type. The expectation is that these electrical lines shall be </w:t>
       </w:r>
       <w:r>
         <w:t xml:space="preserve">identified </w:t>
       </w:r>
       <w:r>
-        <w:t xml:space="preserve">as a separate class type e.g. </w:t>
-      </w:r>
-      <w:proofErr w:type="spellStart"/>
-      <w:r>
-        <w:t>ElectricalLineFunction</w:t>
-      </w:r>
-      <w:proofErr w:type="spellEnd"/>
-      <w:r>
-        <w:t>.</w:t>
-      </w:r>
-    </w:p>
-    <w:p>
-      <w:pPr>
-        <w:pStyle w:val="BodyText"/>
+        <w:t>as a separate class type e.g. ElectricalLineFunction.</w:t>
+      </w:r>
+    </w:p>
+    <w:p>
+      <w:pPr>
+        <w:pStyle w:val="Textkrper"/>
         <w:keepNext/>
       </w:pPr>
       <w:r>
@@ -6997,20 +6829,15 @@
     </w:p>
     <w:p>
       <w:pPr>
-        <w:pStyle w:val="Caption"/>
-      </w:pPr>
-      <w:proofErr w:type="gramStart"/>
-      <w:r>
-        <w:t>Figure :</w:t>
-      </w:r>
-      <w:proofErr w:type="gramEnd"/>
-      <w:r>
-        <w:t xml:space="preserve"> Example of electrical line between MCC and pump</w:t>
-      </w:r>
-    </w:p>
-    <w:p>
-      <w:pPr>
-        <w:pStyle w:val="BodyText"/>
+        <w:pStyle w:val="Beschriftung"/>
+      </w:pPr>
+      <w:r>
+        <w:t>Figure : Example of electrical line between MCC and pump</w:t>
+      </w:r>
+    </w:p>
+    <w:p>
+      <w:pPr>
+        <w:pStyle w:val="Textkrper"/>
       </w:pPr>
       <w:r>
         <w:t>Gap:</w:t>
@@ -7018,7 +6845,7 @@
     </w:p>
     <w:p>
       <w:pPr>
-        <w:pStyle w:val="BodyText"/>
+        <w:pStyle w:val="Textkrper"/>
         <w:numPr>
           <w:ilvl w:val="0"/>
           <w:numId w:val="20"/>
@@ -7030,7 +6857,7 @@
     </w:p>
     <w:p>
       <w:pPr>
-        <w:pStyle w:val="BodyText"/>
+        <w:pStyle w:val="Textkrper"/>
         <w:numPr>
           <w:ilvl w:val="0"/>
           <w:numId w:val="20"/>
@@ -7042,7 +6869,7 @@
     </w:p>
     <w:p>
       <w:pPr>
-        <w:pStyle w:val="BodyText"/>
+        <w:pStyle w:val="Textkrper"/>
         <w:numPr>
           <w:ilvl w:val="0"/>
           <w:numId w:val="20"/>
@@ -7054,7 +6881,7 @@
     </w:p>
     <w:p>
       <w:pPr>
-        <w:pStyle w:val="BodyText"/>
+        <w:pStyle w:val="Textkrper"/>
         <w:numPr>
           <w:ilvl w:val="0"/>
           <w:numId w:val="20"/>
@@ -7067,7 +6894,7 @@
     </w:p>
     <w:p>
       <w:pPr>
-        <w:pStyle w:val="BodyText"/>
+        <w:pStyle w:val="Textkrper"/>
         <w:numPr>
           <w:ilvl w:val="0"/>
           <w:numId w:val="20"/>
@@ -7079,7 +6906,7 @@
     </w:p>
     <w:p>
       <w:pPr>
-        <w:pStyle w:val="Heading2"/>
+        <w:pStyle w:val="berschrift2"/>
       </w:pPr>
       <w:bookmarkStart w:id="14" w:name="_Toc206410179"/>
       <w:r>
@@ -7089,7 +6916,7 @@
     </w:p>
     <w:p>
       <w:pPr>
-        <w:pStyle w:val="BodyText"/>
+        <w:pStyle w:val="Textkrper"/>
       </w:pPr>
       <w:r>
         <w:t xml:space="preserve">Clamp-on measuring elements are measuring instruments that are fitted externally to the pipe using clamp-on mounting. These measuring devices are not in-line as they are not in direct contact with the process fluid, however, they are often drafted as in-line elements. The current DISC DEXPI requirements models these elements as in-line. </w:t>
@@ -7109,7 +6936,7 @@
     </w:p>
     <w:p>
       <w:pPr>
-        <w:pStyle w:val="BodyText"/>
+        <w:pStyle w:val="Textkrper"/>
       </w:pPr>
       <w:r>
         <w:t>Gap:</w:t>
@@ -7117,7 +6944,7 @@
     </w:p>
     <w:p>
       <w:pPr>
-        <w:pStyle w:val="BodyText"/>
+        <w:pStyle w:val="Textkrper"/>
         <w:numPr>
           <w:ilvl w:val="0"/>
           <w:numId w:val="20"/>
@@ -7129,7 +6956,7 @@
     </w:p>
     <w:p>
       <w:pPr>
-        <w:pStyle w:val="BodyText"/>
+        <w:pStyle w:val="Textkrper"/>
         <w:numPr>
           <w:ilvl w:val="0"/>
           <w:numId w:val="20"/>
@@ -7141,7 +6968,7 @@
     </w:p>
     <w:p>
       <w:pPr>
-        <w:pStyle w:val="BodyText"/>
+        <w:pStyle w:val="Textkrper"/>
         <w:numPr>
           <w:ilvl w:val="0"/>
           <w:numId w:val="20"/>
@@ -7153,7 +6980,7 @@
     </w:p>
     <w:p>
       <w:pPr>
-        <w:pStyle w:val="BodyText"/>
+        <w:pStyle w:val="Textkrper"/>
         <w:numPr>
           <w:ilvl w:val="0"/>
           <w:numId w:val="20"/>
@@ -7165,7 +6992,7 @@
     </w:p>
     <w:p>
       <w:pPr>
-        <w:pStyle w:val="BodyText"/>
+        <w:pStyle w:val="Textkrper"/>
         <w:numPr>
           <w:ilvl w:val="0"/>
           <w:numId w:val="20"/>
@@ -7177,7 +7004,7 @@
     </w:p>
     <w:p>
       <w:pPr>
-        <w:pStyle w:val="Heading2"/>
+        <w:pStyle w:val="berschrift2"/>
       </w:pPr>
       <w:bookmarkStart w:id="15" w:name="_Toc206410180"/>
       <w:r>
@@ -7187,7 +7014,7 @@
     </w:p>
     <w:p>
       <w:pPr>
-        <w:pStyle w:val="BodyText"/>
+        <w:pStyle w:val="Textkrper"/>
       </w:pPr>
       <w:r>
         <w:t>Update symbol machine readable files to ensure correct information is ma</w:t>
@@ -7204,7 +7031,7 @@
     </w:p>
     <w:p>
       <w:pPr>
-        <w:pStyle w:val="BodyText"/>
+        <w:pStyle w:val="Textkrper"/>
       </w:pPr>
       <w:r>
         <w:t>Gap:</w:t>
@@ -7212,7 +7039,7 @@
     </w:p>
     <w:p>
       <w:pPr>
-        <w:pStyle w:val="BodyText"/>
+        <w:pStyle w:val="Textkrper"/>
         <w:numPr>
           <w:ilvl w:val="0"/>
           <w:numId w:val="20"/>
@@ -7224,7 +7051,7 @@
     </w:p>
     <w:p>
       <w:pPr>
-        <w:pStyle w:val="BodyText"/>
+        <w:pStyle w:val="Textkrper"/>
         <w:numPr>
           <w:ilvl w:val="1"/>
           <w:numId w:val="20"/>
@@ -7236,7 +7063,7 @@
     </w:p>
     <w:p>
       <w:pPr>
-        <w:pStyle w:val="BodyText"/>
+        <w:pStyle w:val="Textkrper"/>
         <w:numPr>
           <w:ilvl w:val="1"/>
           <w:numId w:val="20"/>
@@ -7248,7 +7075,7 @@
     </w:p>
     <w:p>
       <w:pPr>
-        <w:pStyle w:val="BodyText"/>
+        <w:pStyle w:val="Textkrper"/>
         <w:numPr>
           <w:ilvl w:val="0"/>
           <w:numId w:val="20"/>
@@ -7260,7 +7087,7 @@
     </w:p>
     <w:p>
       <w:pPr>
-        <w:pStyle w:val="Heading2"/>
+        <w:pStyle w:val="berschrift2"/>
       </w:pPr>
       <w:bookmarkStart w:id="16" w:name="_Toc206410181"/>
       <w:r>
@@ -7270,7 +7097,7 @@
     </w:p>
     <w:p>
       <w:pPr>
-        <w:pStyle w:val="BodyText"/>
+        <w:pStyle w:val="Textkrper"/>
       </w:pPr>
       <w:r>
         <w:t>A small number of name changes are introduced in DEXPI 2.0 that impact the DISC DEXPI requirement documentation.</w:t>
@@ -7278,7 +7105,7 @@
     </w:p>
     <w:p>
       <w:pPr>
-        <w:pStyle w:val="BodyText"/>
+        <w:pStyle w:val="Textkrper"/>
       </w:pPr>
       <w:r>
         <w:t>Gap:</w:t>
@@ -7286,7 +7113,7 @@
     </w:p>
     <w:p>
       <w:pPr>
-        <w:pStyle w:val="BodyText"/>
+        <w:pStyle w:val="Textkrper"/>
         <w:numPr>
           <w:ilvl w:val="0"/>
           <w:numId w:val="20"/>
@@ -7298,7 +7125,7 @@
     </w:p>
     <w:p>
       <w:pPr>
-        <w:pStyle w:val="BodyText"/>
+        <w:pStyle w:val="Textkrper"/>
         <w:numPr>
           <w:ilvl w:val="0"/>
           <w:numId w:val="20"/>
@@ -7310,7 +7137,7 @@
     </w:p>
     <w:p>
       <w:pPr>
-        <w:pStyle w:val="Heading2"/>
+        <w:pStyle w:val="berschrift2"/>
       </w:pPr>
       <w:bookmarkStart w:id="17" w:name="_Toc206410182"/>
       <w:r>
@@ -7320,22 +7147,14 @@
     </w:p>
     <w:p>
       <w:pPr>
-        <w:pStyle w:val="BodyText"/>
+        <w:pStyle w:val="Textkrper"/>
       </w:pPr>
       <w:r>
         <w:lastRenderedPageBreak/>
         <w:t xml:space="preserve">The machine-readable profile </w:t>
       </w:r>
       <w:r>
-        <w:t>(</w:t>
-      </w:r>
-      <w:proofErr w:type="spellStart"/>
-      <w:r>
-        <w:t>DiscProfile</w:t>
-      </w:r>
-      <w:proofErr w:type="spellEnd"/>
-      <w:r>
-        <w:t xml:space="preserve"> RC 1.xml) </w:t>
+        <w:t xml:space="preserve">(DiscProfile RC 1.xml) </w:t>
       </w:r>
       <w:r>
         <w:t>provides easy access to the content of the various sources (Excel file with several tables</w:t>
@@ -7344,15 +7163,7 @@
         <w:t>;</w:t>
       </w:r>
       <w:r>
-        <w:t xml:space="preserve"> </w:t>
-      </w:r>
-      <w:proofErr w:type="spellStart"/>
-      <w:r>
-        <w:t>Drawio</w:t>
-      </w:r>
-      <w:proofErr w:type="spellEnd"/>
-      <w:r>
-        <w:t xml:space="preserve"> and SVG files) that describe the DISC DEXPI Profile. While in principle machine readable, the so-far existing files provide only </w:t>
+        <w:t xml:space="preserve"> Drawio and SVG files) that describe the DISC DEXPI Profile. While in principle machine readable, the so-far existing files provide only </w:t>
       </w:r>
       <w:r>
         <w:t>cumbersome</w:t>
@@ -7369,7 +7180,7 @@
     </w:p>
     <w:p>
       <w:pPr>
-        <w:pStyle w:val="BodyText"/>
+        <w:pStyle w:val="Textkrper"/>
       </w:pPr>
       <w:r>
         <w:t xml:space="preserve">From a formal point of view, the DISC DEXPI Profile </w:t>
@@ -7377,7 +7188,7 @@
     </w:p>
     <w:p>
       <w:pPr>
-        <w:pStyle w:val="BodyText"/>
+        <w:pStyle w:val="Textkrper"/>
         <w:numPr>
           <w:ilvl w:val="0"/>
           <w:numId w:val="23"/>
@@ -7389,7 +7200,7 @@
     </w:p>
     <w:p>
       <w:pPr>
-        <w:pStyle w:val="BodyText"/>
+        <w:pStyle w:val="Textkrper"/>
         <w:numPr>
           <w:ilvl w:val="0"/>
           <w:numId w:val="23"/>
@@ -7413,7 +7224,7 @@
     </w:p>
     <w:p>
       <w:pPr>
-        <w:pStyle w:val="BodyText"/>
+        <w:pStyle w:val="Textkrper"/>
       </w:pPr>
       <w:r>
         <w:t xml:space="preserve">The new DEXPI 2.0 Exchange Format (DEXPI XML) has been designed to support </w:t>
@@ -7422,23 +7233,7 @@
         <w:t xml:space="preserve">[1] </w:t>
       </w:r>
       <w:r>
-        <w:t xml:space="preserve">extensions </w:t>
-      </w:r>
-      <w:proofErr w:type="gramStart"/>
-      <w:r>
-        <w:t>For</w:t>
-      </w:r>
-      <w:proofErr w:type="gramEnd"/>
-      <w:r>
-        <w:t xml:space="preserve"> example, the following excerpt from </w:t>
-      </w:r>
-      <w:proofErr w:type="spellStart"/>
-      <w:r>
-        <w:t>DiscProfile</w:t>
-      </w:r>
-      <w:proofErr w:type="spellEnd"/>
-      <w:r>
-        <w:t xml:space="preserve"> RC 1.xml shows the definition of a new class type:</w:t>
+        <w:t>extensions For example, the following excerpt from DiscProfile RC 1.xml shows the definition of a new class type:</w:t>
       </w:r>
     </w:p>
     <w:p>
@@ -7446,61 +7241,13 @@
         <w:pStyle w:val="XML"/>
       </w:pPr>
       <w:r>
-        <w:t>&lt;</w:t>
-      </w:r>
-      <w:proofErr w:type="spellStart"/>
-      <w:r>
-        <w:t>ConcreteClass</w:t>
-      </w:r>
-      <w:proofErr w:type="spellEnd"/>
-      <w:r>
-        <w:t xml:space="preserve"> name="</w:t>
-      </w:r>
-      <w:proofErr w:type="spellStart"/>
-      <w:r>
-        <w:t>AcousticNoiceReducer</w:t>
-      </w:r>
-      <w:proofErr w:type="spellEnd"/>
-      <w:r>
-        <w:t xml:space="preserve">" </w:t>
-      </w:r>
-      <w:proofErr w:type="spellStart"/>
-      <w:r>
-        <w:t>superTypes</w:t>
-      </w:r>
-      <w:proofErr w:type="spellEnd"/>
-      <w:r>
-        <w:t>="Plant/</w:t>
-      </w:r>
-      <w:proofErr w:type="spellStart"/>
-      <w:r>
-        <w:t>Piping.PipingComponent</w:t>
-      </w:r>
-      <w:proofErr w:type="spellEnd"/>
-      <w:r>
-        <w:t>"&gt;</w:t>
+        <w:t>&lt;ConcreteClass name="AcousticNoiceReducer" superTypes="Plant/Piping.PipingComponent"&gt;</w:t>
       </w:r>
       <w:r>
         <w:br/>
       </w:r>
       <w:r>
-        <w:t xml:space="preserve">  &lt;Data property="</w:t>
-      </w:r>
-      <w:proofErr w:type="spellStart"/>
-      <w:r>
-        <w:t>DexpiMeta</w:t>
-      </w:r>
-      <w:proofErr w:type="spellEnd"/>
-      <w:r>
-        <w:t>/</w:t>
-      </w:r>
-      <w:proofErr w:type="spellStart"/>
-      <w:r>
-        <w:t>rdl_uri</w:t>
-      </w:r>
-      <w:proofErr w:type="spellEnd"/>
-      <w:r>
-        <w:t>"&gt;</w:t>
+        <w:t xml:space="preserve">  &lt;Data property="DexpiMeta/rdl_uri"&gt;</w:t>
       </w:r>
       <w:r>
         <w:br/>
@@ -7518,23 +7265,7 @@
         <w:br/>
       </w:r>
       <w:r>
-        <w:t xml:space="preserve">  &lt;Data property="</w:t>
-      </w:r>
-      <w:proofErr w:type="spellStart"/>
-      <w:r>
-        <w:t>DexpiMeta</w:t>
-      </w:r>
-      <w:proofErr w:type="spellEnd"/>
-      <w:r>
-        <w:t>/</w:t>
-      </w:r>
-      <w:proofErr w:type="spellStart"/>
-      <w:r>
-        <w:t>rdl_label</w:t>
-      </w:r>
-      <w:proofErr w:type="spellEnd"/>
-      <w:r>
-        <w:t>"&gt;</w:t>
+        <w:t xml:space="preserve">  &lt;Data property="DexpiMeta/rdl_label"&gt;</w:t>
       </w:r>
       <w:r>
         <w:br/>
@@ -7552,20 +7283,12 @@
         <w:br/>
       </w:r>
       <w:r>
-        <w:t>&lt;/</w:t>
-      </w:r>
-      <w:proofErr w:type="spellStart"/>
-      <w:r>
-        <w:t>ConcreteClass</w:t>
-      </w:r>
-      <w:proofErr w:type="spellEnd"/>
-      <w:r>
-        <w:t>&gt;</w:t>
-      </w:r>
-    </w:p>
-    <w:p>
-      <w:pPr>
-        <w:pStyle w:val="BodyText"/>
+        <w:t>&lt;/ConcreteClass&gt;</w:t>
+      </w:r>
+    </w:p>
+    <w:p>
+      <w:pPr>
+        <w:pStyle w:val="Textkrper"/>
       </w:pPr>
       <w:r>
         <w:t xml:space="preserve">Another excerpt demonstrates the extension </w:t>
@@ -7577,15 +7300,7 @@
         <w:t xml:space="preserve">the existing DEXPI class </w:t>
       </w:r>
       <w:r>
-        <w:t xml:space="preserve">Equipment with a property called </w:t>
-      </w:r>
-      <w:proofErr w:type="spellStart"/>
-      <w:r>
-        <w:t>ObjectDisplayName</w:t>
-      </w:r>
-      <w:proofErr w:type="spellEnd"/>
-      <w:r>
-        <w:t xml:space="preserve"> of type String or Undefined:</w:t>
+        <w:t>Equipment with a property called ObjectDisplayName of type String or Undefined:</w:t>
       </w:r>
     </w:p>
     <w:p>
@@ -7593,159 +7308,31 @@
         <w:pStyle w:val="XML"/>
       </w:pPr>
       <w:r>
-        <w:t>&lt;</w:t>
-      </w:r>
-      <w:proofErr w:type="spellStart"/>
-      <w:r>
-        <w:t>ClassExtension</w:t>
-      </w:r>
-      <w:proofErr w:type="spellEnd"/>
-      <w:r>
-        <w:t xml:space="preserve"> name="</w:t>
-      </w:r>
-      <w:proofErr w:type="spellStart"/>
-      <w:r>
-        <w:t>EquipmentExtension</w:t>
-      </w:r>
-      <w:proofErr w:type="spellEnd"/>
-      <w:r>
-        <w:t xml:space="preserve">" </w:t>
-      </w:r>
-      <w:proofErr w:type="spellStart"/>
-      <w:r>
-        <w:t>baseType</w:t>
-      </w:r>
-      <w:proofErr w:type="spellEnd"/>
-      <w:r>
-        <w:t>="Plant/</w:t>
-      </w:r>
-      <w:proofErr w:type="spellStart"/>
-      <w:r>
-        <w:t>Equipment.Equipment</w:t>
-      </w:r>
-      <w:proofErr w:type="spellEnd"/>
-      <w:r>
-        <w:t>"&gt;</w:t>
+        <w:t>&lt;ClassExtension name="EquipmentExtension" baseType="Plant/Equipment.Equipment"&gt;</w:t>
       </w:r>
       <w:r>
         <w:br/>
-        <w:t xml:space="preserve">  &lt;</w:t>
-      </w:r>
-      <w:proofErr w:type="spellStart"/>
-      <w:r>
-        <w:t>DataProperty</w:t>
-      </w:r>
-      <w:proofErr w:type="spellEnd"/>
-      <w:r>
-        <w:t xml:space="preserve"> name="</w:t>
-      </w:r>
-      <w:proofErr w:type="spellStart"/>
-      <w:r>
-        <w:t>ObjectDisplayName</w:t>
-      </w:r>
-      <w:proofErr w:type="spellEnd"/>
-      <w:r>
-        <w:t xml:space="preserve">" </w:t>
-      </w:r>
-      <w:proofErr w:type="spellStart"/>
-      <w:r>
-        <w:t>isOrdered</w:t>
-      </w:r>
-      <w:proofErr w:type="spellEnd"/>
-      <w:r>
-        <w:t xml:space="preserve">="false" </w:t>
-      </w:r>
-      <w:proofErr w:type="spellStart"/>
-      <w:r>
-        <w:t>isUnique</w:t>
-      </w:r>
-      <w:proofErr w:type="spellEnd"/>
-      <w:r>
-        <w:t>="false" lower="0" upper="1"&gt;</w:t>
+        <w:t xml:space="preserve">  &lt;DataProperty name="ObjectDisplayName" isOrdered="false" isUnique="false" lower="0" upper="1"&gt;</w:t>
       </w:r>
       <w:r>
         <w:br/>
-        <w:t xml:space="preserve">    &lt;</w:t>
-      </w:r>
-      <w:proofErr w:type="spellStart"/>
-      <w:r>
-        <w:t>UnionDataType</w:t>
-      </w:r>
-      <w:proofErr w:type="spellEnd"/>
-      <w:r>
-        <w:t>&gt;</w:t>
+        <w:t xml:space="preserve">    &lt;UnionDataType&gt;</w:t>
       </w:r>
       <w:r>
         <w:br/>
-        <w:t xml:space="preserve">      &lt;</w:t>
-      </w:r>
-      <w:proofErr w:type="spellStart"/>
-      <w:r>
-        <w:t>DataTypeReference</w:t>
-      </w:r>
-      <w:proofErr w:type="spellEnd"/>
-      <w:r>
-        <w:t xml:space="preserve"> type="</w:t>
-      </w:r>
-      <w:proofErr w:type="spellStart"/>
-      <w:r>
-        <w:t>Builtin</w:t>
-      </w:r>
-      <w:proofErr w:type="spellEnd"/>
-      <w:r>
-        <w:t>/Undefined"/&gt;</w:t>
+        <w:t xml:space="preserve">      &lt;DataTypeReference type="Builtin/Undefined"/&gt;</w:t>
       </w:r>
       <w:r>
         <w:br/>
-        <w:t xml:space="preserve">      &lt;</w:t>
-      </w:r>
-      <w:proofErr w:type="spellStart"/>
-      <w:r>
-        <w:t>DataTypeReference</w:t>
-      </w:r>
-      <w:proofErr w:type="spellEnd"/>
-      <w:r>
-        <w:t xml:space="preserve"> type="</w:t>
-      </w:r>
-      <w:proofErr w:type="spellStart"/>
-      <w:r>
-        <w:t>Builtin</w:t>
-      </w:r>
-      <w:proofErr w:type="spellEnd"/>
-      <w:r>
-        <w:t>/String"/&gt;</w:t>
+        <w:t xml:space="preserve">      &lt;DataTypeReference type="Builtin/String"/&gt;</w:t>
       </w:r>
       <w:r>
         <w:br/>
-        <w:t xml:space="preserve">    &lt;/</w:t>
-      </w:r>
-      <w:proofErr w:type="spellStart"/>
-      <w:r>
-        <w:t>UnionDataType</w:t>
-      </w:r>
-      <w:proofErr w:type="spellEnd"/>
-      <w:r>
-        <w:t>&gt;</w:t>
+        <w:t xml:space="preserve">    &lt;/UnionDataType&gt;</w:t>
       </w:r>
       <w:r>
         <w:br/>
-        <w:t xml:space="preserve">    &lt;Data property="</w:t>
-      </w:r>
-      <w:proofErr w:type="spellStart"/>
-      <w:r>
-        <w:t>DexpiMeta</w:t>
-      </w:r>
-      <w:proofErr w:type="spellEnd"/>
-      <w:r>
-        <w:t>/</w:t>
-      </w:r>
-      <w:proofErr w:type="spellStart"/>
-      <w:r>
-        <w:t>rdl_uri</w:t>
-      </w:r>
-      <w:proofErr w:type="spellEnd"/>
-      <w:r>
-        <w:t>"&gt;</w:t>
+        <w:t xml:space="preserve">    &lt;Data property="DexpiMeta/rdl_uri"&gt;</w:t>
       </w:r>
       <w:r>
         <w:br/>
@@ -7757,23 +7344,7 @@
       </w:r>
       <w:r>
         <w:br/>
-        <w:t xml:space="preserve">    &lt;Data property="</w:t>
-      </w:r>
-      <w:proofErr w:type="spellStart"/>
-      <w:r>
-        <w:t>DexpiMeta</w:t>
-      </w:r>
-      <w:proofErr w:type="spellEnd"/>
-      <w:r>
-        <w:t>/</w:t>
-      </w:r>
-      <w:proofErr w:type="spellStart"/>
-      <w:r>
-        <w:t>rdl_label</w:t>
-      </w:r>
-      <w:proofErr w:type="spellEnd"/>
-      <w:r>
-        <w:t>"&gt;</w:t>
+        <w:t xml:space="preserve">    &lt;Data property="DexpiMeta/rdl_label"&gt;</w:t>
       </w:r>
       <w:r>
         <w:br/>
@@ -7785,15 +7356,7 @@
       </w:r>
       <w:r>
         <w:br/>
-        <w:t xml:space="preserve">  &lt;/</w:t>
-      </w:r>
-      <w:proofErr w:type="spellStart"/>
-      <w:r>
-        <w:t>DataProperty</w:t>
-      </w:r>
-      <w:proofErr w:type="spellEnd"/>
-      <w:r>
-        <w:t>&gt;</w:t>
+        <w:t xml:space="preserve">  &lt;/DataProperty&gt;</w:t>
       </w:r>
       <w:r>
         <w:br/>
@@ -7801,20 +7364,12 @@
       </w:r>
       <w:r>
         <w:br/>
-        <w:t>&lt;</w:t>
-      </w:r>
-      <w:proofErr w:type="spellStart"/>
-      <w:r>
-        <w:t>ClassExtension</w:t>
-      </w:r>
-      <w:proofErr w:type="spellEnd"/>
-      <w:r>
-        <w:t>&gt;</w:t>
-      </w:r>
-    </w:p>
-    <w:p>
-      <w:pPr>
-        <w:pStyle w:val="BodyText"/>
+        <w:t>&lt;ClassExtension&gt;</w:t>
+      </w:r>
+    </w:p>
+    <w:p>
+      <w:pPr>
+        <w:pStyle w:val="Textkrper"/>
       </w:pPr>
       <w:r>
         <w:t xml:space="preserve">DEXPI does not yet provide a canonical solution for [2] constraints. To this end, a proposal for a suitable DEXPI extension (Profile RC 1.xml, work in progress) is required. The current version of this extension supports the definition of </w:t>
@@ -7831,29 +7386,16 @@
     </w:p>
     <w:p>
       <w:pPr>
-        <w:pStyle w:val="BodyText"/>
+        <w:pStyle w:val="Textkrper"/>
       </w:pPr>
       <w:r>
         <w:t xml:space="preserve">The following excerpt defines DISC symbol ND0004 for </w:t>
       </w:r>
-      <w:proofErr w:type="spellStart"/>
       <w:r>
         <w:t>DoubleBlockAndBleedValve</w:t>
       </w:r>
       <w:r>
-        <w:t>s</w:t>
-      </w:r>
-      <w:proofErr w:type="spellEnd"/>
-      <w:r>
-        <w:t xml:space="preserve">. The symbol exists in two variants, depending on the </w:t>
-      </w:r>
-      <w:proofErr w:type="spellStart"/>
-      <w:r>
-        <w:t>ValvePosition</w:t>
-      </w:r>
-      <w:proofErr w:type="spellEnd"/>
-      <w:r>
-        <w:t>:</w:t>
+        <w:t>s. The symbol exists in two variants, depending on the ValvePosition:</w:t>
       </w:r>
     </w:p>
     <w:p>
@@ -7869,15 +7411,7 @@
       </w:r>
       <w:r>
         <w:br/>
-        <w:t xml:space="preserve">    &lt;Object name="ND0004_0" type="Profile/</w:t>
-      </w:r>
-      <w:proofErr w:type="spellStart"/>
-      <w:r>
-        <w:t>SymbolVariant</w:t>
-      </w:r>
-      <w:proofErr w:type="spellEnd"/>
-      <w:r>
-        <w:t>"&gt;</w:t>
+        <w:t xml:space="preserve">    &lt;Object name="ND0004_0" type="Profile/SymbolVariant"&gt;</w:t>
       </w:r>
       <w:r>
         <w:br/>
@@ -7888,15 +7422,7 @@
       </w:r>
       <w:r>
         <w:br/>
-        <w:t xml:space="preserve">        &lt;Object type="Core/</w:t>
-      </w:r>
-      <w:proofErr w:type="spellStart"/>
-      <w:r>
-        <w:t>Diagram.PolyLine</w:t>
-      </w:r>
-      <w:proofErr w:type="spellEnd"/>
-      <w:r>
-        <w:t>"&gt;...&lt;/Object&gt;</w:t>
+        <w:t xml:space="preserve">        &lt;Object type="Core/Diagram.PolyLine"&gt;...&lt;/Object&gt;</w:t>
       </w:r>
       <w:r>
         <w:br/>
@@ -7916,15 +7442,7 @@
       </w:r>
       <w:r>
         <w:br/>
-        <w:t xml:space="preserve">    &lt;Object name="ND0004_1" type="Profile/</w:t>
-      </w:r>
-      <w:proofErr w:type="spellStart"/>
-      <w:r>
-        <w:t>SymbolVariant</w:t>
-      </w:r>
-      <w:proofErr w:type="spellEnd"/>
-      <w:r>
-        <w:t>"&gt;</w:t>
+        <w:t xml:space="preserve">    &lt;Object name="ND0004_1" type="Profile/SymbolVariant"&gt;</w:t>
       </w:r>
       <w:r>
         <w:br/>
@@ -7932,15 +7450,7 @@
       </w:r>
       <w:r>
         <w:br/>
-        <w:t xml:space="preserve">        &lt;String&gt;</w:t>
-      </w:r>
-      <w:proofErr w:type="spellStart"/>
-      <w:r>
-        <w:t>ValvePosition</w:t>
-      </w:r>
-      <w:proofErr w:type="spellEnd"/>
-      <w:r>
-        <w:t xml:space="preserve"> = 'NC'&lt;/String&gt;</w:t>
+        <w:t xml:space="preserve">        &lt;String&gt;ValvePosition = 'NC'&lt;/String&gt;</w:t>
       </w:r>
       <w:r>
         <w:br/>
@@ -7952,15 +7462,7 @@
       </w:r>
       <w:r>
         <w:br/>
-        <w:t xml:space="preserve">        &lt;Object type="Core/</w:t>
-      </w:r>
-      <w:proofErr w:type="spellStart"/>
-      <w:r>
-        <w:t>Diagram.PolyLine</w:t>
-      </w:r>
-      <w:proofErr w:type="spellEnd"/>
-      <w:r>
-        <w:t>"&gt;...&lt;/Object&gt;</w:t>
+        <w:t xml:space="preserve">        &lt;Object type="Core/Diagram.PolyLine"&gt;...&lt;/Object&gt;</w:t>
       </w:r>
       <w:r>
         <w:br/>
@@ -7984,15 +7486,7 @@
       </w:r>
       <w:r>
         <w:br/>
-        <w:t xml:space="preserve">  &lt;Data property="</w:t>
-      </w:r>
-      <w:proofErr w:type="spellStart"/>
-      <w:r>
-        <w:t>DexpiMeta</w:t>
-      </w:r>
-      <w:proofErr w:type="spellEnd"/>
-      <w:r>
-        <w:t>/usage"&gt;</w:t>
+        <w:t xml:space="preserve">  &lt;Data property="DexpiMeta/usage"&gt;</w:t>
       </w:r>
       <w:r>
         <w:br/>
@@ -8009,18 +7503,10 @@
     </w:p>
     <w:p>
       <w:pPr>
-        <w:pStyle w:val="BodyText"/>
-      </w:pPr>
-      <w:r>
-        <w:t xml:space="preserve">Further work will include the remaining information from the Excel, </w:t>
-      </w:r>
-      <w:proofErr w:type="spellStart"/>
-      <w:r>
-        <w:t>Drawio</w:t>
-      </w:r>
-      <w:proofErr w:type="spellEnd"/>
-      <w:r>
-        <w:t xml:space="preserve">, and </w:t>
+        <w:pStyle w:val="Textkrper"/>
+      </w:pPr>
+      <w:r>
+        <w:t xml:space="preserve">Further work will include the remaining information from the Excel, Drawio, and </w:t>
       </w:r>
       <w:r>
         <w:t>SVG</w:t>
@@ -8031,7 +7517,7 @@
     </w:p>
     <w:p>
       <w:pPr>
-        <w:pStyle w:val="BodyText"/>
+        <w:pStyle w:val="Textkrper"/>
         <w:numPr>
           <w:ilvl w:val="0"/>
           <w:numId w:val="24"/>
@@ -8043,7 +7529,7 @@
     </w:p>
     <w:p>
       <w:pPr>
-        <w:pStyle w:val="BodyText"/>
+        <w:pStyle w:val="Textkrper"/>
         <w:numPr>
           <w:ilvl w:val="0"/>
           <w:numId w:val="24"/>
@@ -8055,7 +7541,7 @@
     </w:p>
     <w:p>
       <w:pPr>
-        <w:pStyle w:val="BodyText"/>
+        <w:pStyle w:val="Textkrper"/>
         <w:numPr>
           <w:ilvl w:val="0"/>
           <w:numId w:val="24"/>
@@ -8067,7 +7553,7 @@
     </w:p>
     <w:p>
       <w:pPr>
-        <w:pStyle w:val="BodyText"/>
+        <w:pStyle w:val="Textkrper"/>
       </w:pPr>
       <w:r>
         <w:t>For validation and demonstration of the machine-readable profile, a</w:t>
@@ -8099,7 +7585,7 @@
     </w:p>
     <w:p>
       <w:pPr>
-        <w:pStyle w:val="BodyText"/>
+        <w:pStyle w:val="Textkrper"/>
         <w:numPr>
           <w:ilvl w:val="0"/>
           <w:numId w:val="25"/>
@@ -8108,11 +7594,9 @@
       <w:r>
         <w:t xml:space="preserve">New DISC class: </w:t>
       </w:r>
-      <w:proofErr w:type="spellStart"/>
       <w:r>
         <w:t>AcousticNoiceReducer</w:t>
       </w:r>
-      <w:proofErr w:type="spellEnd"/>
       <w:r>
         <w:br/>
       </w:r>
@@ -8163,7 +7647,7 @@
     </w:p>
     <w:p>
       <w:pPr>
-        <w:pStyle w:val="BodyText"/>
+        <w:pStyle w:val="Textkrper"/>
         <w:numPr>
           <w:ilvl w:val="0"/>
           <w:numId w:val="25"/>
@@ -8224,7 +7708,7 @@
     </w:p>
     <w:p>
       <w:pPr>
-        <w:pStyle w:val="BodyText"/>
+        <w:pStyle w:val="Textkrper"/>
         <w:numPr>
           <w:ilvl w:val="0"/>
           <w:numId w:val="25"/>
@@ -8283,7 +7767,7 @@
     </w:p>
     <w:p>
       <w:pPr>
-        <w:pStyle w:val="BodyText"/>
+        <w:pStyle w:val="Textkrper"/>
       </w:pPr>
       <w:r>
         <w:t>Gap:</w:t>
@@ -8291,7 +7775,7 @@
     </w:p>
     <w:p>
       <w:pPr>
-        <w:pStyle w:val="BodyText"/>
+        <w:pStyle w:val="Textkrper"/>
         <w:numPr>
           <w:ilvl w:val="0"/>
           <w:numId w:val="26"/>
@@ -8303,31 +7787,343 @@
     </w:p>
     <w:p>
       <w:pPr>
-        <w:pStyle w:val="BodyText"/>
+        <w:pStyle w:val="Textkrper"/>
         <w:numPr>
           <w:ilvl w:val="0"/>
           <w:numId w:val="26"/>
         </w:numPr>
       </w:pPr>
       <w:r>
-        <w:t xml:space="preserve">Extraction of remaining information from the Excel, </w:t>
-      </w:r>
-      <w:proofErr w:type="spellStart"/>
-      <w:r>
-        <w:t>Drawio</w:t>
-      </w:r>
-      <w:proofErr w:type="spellEnd"/>
-      <w:r>
-        <w:t xml:space="preserve">, and SVG sources and inclusion in </w:t>
-      </w:r>
-      <w:proofErr w:type="spellStart"/>
-      <w:r>
-        <w:t>DiscProfile</w:t>
-      </w:r>
-      <w:proofErr w:type="spellEnd"/>
-      <w:r>
-        <w:t xml:space="preserve"> RC 1</w:t>
-      </w:r>
+        <w:t>Extraction of remaining information from the Excel, Drawio, and SVG sources and inclusion in DiscProfile RC 1</w:t>
+      </w:r>
+    </w:p>
+    <w:p>
+      <w:pPr>
+        <w:pStyle w:val="berschrift2"/>
+        <w:rPr>
+          <w:ins w:id="18" w:author="Manfred Theißen" w:date="2025-08-18T17:39:00Z" w16du:dateUtc="2025-08-18T15:39:00Z"/>
+        </w:rPr>
+      </w:pPr>
+      <w:ins w:id="19" w:author="Manfred Theißen" w:date="2025-08-18T17:39:00Z" w16du:dateUtc="2025-08-18T15:39:00Z">
+        <w:r>
+          <w:t>Blueprint Files</w:t>
+        </w:r>
+      </w:ins>
+    </w:p>
+    <w:p>
+      <w:pPr>
+        <w:pStyle w:val="Textkrper"/>
+        <w:rPr>
+          <w:ins w:id="20" w:author="Manfred Theißen" w:date="2025-08-18T17:39:00Z" w16du:dateUtc="2025-08-18T15:39:00Z"/>
+        </w:rPr>
+      </w:pPr>
+      <w:ins w:id="21" w:author="Manfred Theißen" w:date="2025-08-18T17:39:00Z" w16du:dateUtc="2025-08-18T15:39:00Z">
+        <w:r>
+          <w:t>Already in the NOAKA DEXPI Project, a series of blueprint files has been created. Each file is a DEXPI Proteus XML file with a NOAKA-compliant variant of the DEXPI reference P&amp;ID. Within the series of files, small changes, such as the addition of a valve or the removal of an instrument, mimic typical workflows that CAE tools have to support.</w:t>
+        </w:r>
+      </w:ins>
+    </w:p>
+    <w:p>
+      <w:pPr>
+        <w:pStyle w:val="Textkrper"/>
+        <w:rPr>
+          <w:ins w:id="22" w:author="Manfred Theißen" w:date="2025-08-18T17:39:00Z" w16du:dateUtc="2025-08-18T15:39:00Z"/>
+        </w:rPr>
+      </w:pPr>
+      <w:ins w:id="23" w:author="Manfred Theißen" w:date="2025-08-18T17:39:00Z" w16du:dateUtc="2025-08-18T15:39:00Z">
+        <w:r>
+          <w:t>Gap:</w:t>
+        </w:r>
+      </w:ins>
+    </w:p>
+    <w:p>
+      <w:pPr>
+        <w:pStyle w:val="Textkrper"/>
+        <w:numPr>
+          <w:ilvl w:val="0"/>
+          <w:numId w:val="20"/>
+        </w:numPr>
+        <w:rPr>
+          <w:ins w:id="24" w:author="Manfred Theißen" w:date="2025-08-18T17:39:00Z" w16du:dateUtc="2025-08-18T15:39:00Z"/>
+        </w:rPr>
+      </w:pPr>
+      <w:ins w:id="25" w:author="Manfred Theißen" w:date="2025-08-18T17:39:00Z" w16du:dateUtc="2025-08-18T15:39:00Z">
+        <w:r>
+          <w:lastRenderedPageBreak/>
+          <w:t>The existing blueprint files have to be converted to DEXPI 2.0 (new data format; refactoring of “custom” classes and attributes in DEXPI 1.3/1.4 to equivalent DEXPI 2.0 constructs).</w:t>
+        </w:r>
+      </w:ins>
+    </w:p>
+    <w:p>
+      <w:pPr>
+        <w:pStyle w:val="Textkrper"/>
+        <w:numPr>
+          <w:ilvl w:val="0"/>
+          <w:numId w:val="20"/>
+        </w:numPr>
+        <w:rPr>
+          <w:ins w:id="26" w:author="Manfred Theißen" w:date="2025-08-18T17:39:00Z" w16du:dateUtc="2025-08-18T15:39:00Z"/>
+        </w:rPr>
+      </w:pPr>
+      <w:ins w:id="27" w:author="Manfred Theißen" w:date="2025-08-18T17:39:00Z" w16du:dateUtc="2025-08-18T15:39:00Z">
+        <w:r>
+          <w:t>N</w:t>
+        </w:r>
+        <w:r>
+          <w:t>ew blueprint files have to be created that cover some of the new requirements (cf. gaps in domain modeling above).</w:t>
+        </w:r>
+      </w:ins>
+    </w:p>
+    <w:p>
+      <w:pPr>
+        <w:pStyle w:val="berschrift2"/>
+        <w:rPr>
+          <w:ins w:id="28" w:author="Manfred Theißen" w:date="2025-08-18T17:46:00Z" w16du:dateUtc="2025-08-18T15:46:00Z"/>
+        </w:rPr>
+      </w:pPr>
+      <w:ins w:id="29" w:author="Manfred Theißen" w:date="2025-08-18T17:40:00Z" w16du:dateUtc="2025-08-18T15:40:00Z">
+        <w:r>
+          <w:t>Vali</w:t>
+        </w:r>
+      </w:ins>
+      <w:ins w:id="30" w:author="Manfred Theißen" w:date="2025-08-18T17:45:00Z" w16du:dateUtc="2025-08-18T15:45:00Z">
+        <w:r>
+          <w:t>dation Method</w:t>
+        </w:r>
+      </w:ins>
+    </w:p>
+    <w:p>
+      <w:pPr>
+        <w:pStyle w:val="Textkrper"/>
+        <w:rPr>
+          <w:ins w:id="31" w:author="Manfred Theißen" w:date="2025-08-18T17:47:00Z" w16du:dateUtc="2025-08-18T15:47:00Z"/>
+        </w:rPr>
+      </w:pPr>
+      <w:ins w:id="32" w:author="Manfred Theißen" w:date="2025-08-18T17:46:00Z" w16du:dateUtc="2025-08-18T15:46:00Z">
+        <w:r>
+          <w:t>A method for the validation of DEXPI 2.0 files created by the involved CAE tools is required.</w:t>
+        </w:r>
+      </w:ins>
+      <w:ins w:id="33" w:author="Manfred Theißen" w:date="2025-08-18T17:47:00Z" w16du:dateUtc="2025-08-18T15:47:00Z">
+        <w:r>
+          <w:t xml:space="preserve"> Validation should cover</w:t>
+        </w:r>
+      </w:ins>
+    </w:p>
+    <w:p>
+      <w:pPr>
+        <w:pStyle w:val="Textkrper"/>
+        <w:numPr>
+          <w:ilvl w:val="0"/>
+          <w:numId w:val="27"/>
+        </w:numPr>
+        <w:rPr>
+          <w:ins w:id="34" w:author="Manfred Theißen" w:date="2025-08-18T17:48:00Z" w16du:dateUtc="2025-08-18T15:48:00Z"/>
+        </w:rPr>
+      </w:pPr>
+      <w:ins w:id="35" w:author="Manfred Theißen" w:date="2025-08-18T17:49:00Z" w16du:dateUtc="2025-08-18T15:49:00Z">
+        <w:r>
+          <w:t xml:space="preserve">formal </w:t>
+        </w:r>
+      </w:ins>
+      <w:ins w:id="36" w:author="Manfred Theißen" w:date="2025-08-18T17:47:00Z" w16du:dateUtc="2025-08-18T15:47:00Z">
+        <w:r>
+          <w:t>correctness (complia</w:t>
+        </w:r>
+      </w:ins>
+      <w:ins w:id="37" w:author="Manfred Theißen" w:date="2025-08-18T17:48:00Z" w16du:dateUtc="2025-08-18T15:48:00Z">
+        <w:r>
+          <w:t>n</w:t>
+        </w:r>
+      </w:ins>
+      <w:ins w:id="38" w:author="Manfred Theißen" w:date="2025-08-18T17:47:00Z" w16du:dateUtc="2025-08-18T15:47:00Z">
+        <w:r>
+          <w:t>ce with DEXPI XML format</w:t>
+        </w:r>
+      </w:ins>
+      <w:ins w:id="39" w:author="Manfred Theißen" w:date="2025-08-18T17:48:00Z" w16du:dateUtc="2025-08-18T15:48:00Z">
+        <w:r>
+          <w:t>, DEXPI information model, and DISC DEXPI profile) and</w:t>
+        </w:r>
+      </w:ins>
+    </w:p>
+    <w:p>
+      <w:pPr>
+        <w:pStyle w:val="Textkrper"/>
+        <w:numPr>
+          <w:ilvl w:val="0"/>
+          <w:numId w:val="27"/>
+        </w:numPr>
+        <w:rPr>
+          <w:ins w:id="40" w:author="Manfred Theißen" w:date="2025-08-18T17:54:00Z" w16du:dateUtc="2025-08-18T15:54:00Z"/>
+        </w:rPr>
+      </w:pPr>
+      <w:ins w:id="41" w:author="Manfred Theißen" w:date="2025-08-18T17:50:00Z" w16du:dateUtc="2025-08-18T15:50:00Z">
+        <w:r>
+          <w:t xml:space="preserve">correctmess and </w:t>
+        </w:r>
+      </w:ins>
+      <w:ins w:id="42" w:author="Manfred Theißen" w:date="2025-08-18T17:48:00Z" w16du:dateUtc="2025-08-18T15:48:00Z">
+        <w:r>
+          <w:t>completeness</w:t>
+        </w:r>
+      </w:ins>
+      <w:ins w:id="43" w:author="Manfred Theißen" w:date="2025-08-18T17:49:00Z" w16du:dateUtc="2025-08-18T15:49:00Z">
+        <w:r>
+          <w:t xml:space="preserve"> </w:t>
+        </w:r>
+      </w:ins>
+      <w:ins w:id="44" w:author="Manfred Theißen" w:date="2025-08-18T17:50:00Z" w16du:dateUtc="2025-08-18T15:50:00Z">
+        <w:r>
+          <w:t>in terms of content (</w:t>
+        </w:r>
+      </w:ins>
+      <w:ins w:id="45" w:author="Manfred Theißen" w:date="2025-08-18T17:49:00Z" w16du:dateUtc="2025-08-18T15:49:00Z">
+        <w:r>
+          <w:t>e.g.,</w:t>
+        </w:r>
+      </w:ins>
+      <w:ins w:id="46" w:author="Manfred Theißen" w:date="2025-08-18T17:51:00Z" w16du:dateUtc="2025-08-18T15:51:00Z">
+        <w:r>
+          <w:t xml:space="preserve"> while repredocing a blueprint file, the conceptual information (objects and attributes) should be both correct and</w:t>
+        </w:r>
+      </w:ins>
+      <w:ins w:id="47" w:author="Manfred Theißen" w:date="2025-08-18T17:52:00Z" w16du:dateUtc="2025-08-18T15:52:00Z">
+        <w:r>
+          <w:t xml:space="preserve"> complete in a strict sense; for the graphics, certain deviations are admissible provided an engineer per</w:t>
+        </w:r>
+      </w:ins>
+      <w:ins w:id="48" w:author="Manfred Theißen" w:date="2025-08-18T17:53:00Z" w16du:dateUtc="2025-08-18T15:53:00Z">
+        <w:r>
+          <w:t>ceives the diagram as equivalent to the original blueprint’s graphics).</w:t>
+        </w:r>
+      </w:ins>
+    </w:p>
+    <w:p>
+      <w:pPr>
+        <w:pStyle w:val="Textkrper"/>
+        <w:rPr>
+          <w:ins w:id="49" w:author="Manfred Theißen" w:date="2025-08-18T17:54:00Z" w16du:dateUtc="2025-08-18T15:54:00Z"/>
+        </w:rPr>
+      </w:pPr>
+      <w:ins w:id="50" w:author="Manfred Theißen" w:date="2025-08-18T17:54:00Z" w16du:dateUtc="2025-08-18T15:54:00Z">
+        <w:r>
+          <w:t>Gap:</w:t>
+        </w:r>
+      </w:ins>
+    </w:p>
+    <w:p>
+      <w:pPr>
+        <w:pStyle w:val="Textkrper"/>
+        <w:numPr>
+          <w:ilvl w:val="0"/>
+          <w:numId w:val="20"/>
+        </w:numPr>
+        <w:rPr>
+          <w:ins w:id="51" w:author="Manfred Theißen" w:date="2025-08-18T17:55:00Z" w16du:dateUtc="2025-08-18T15:55:00Z"/>
+        </w:rPr>
+      </w:pPr>
+      <w:ins w:id="52" w:author="Manfred Theißen" w:date="2025-08-18T17:54:00Z" w16du:dateUtc="2025-08-18T15:54:00Z">
+        <w:r>
+          <w:t>scoring system</w:t>
+        </w:r>
+      </w:ins>
+    </w:p>
+    <w:p>
+      <w:pPr>
+        <w:pStyle w:val="Textkrper"/>
+        <w:numPr>
+          <w:ilvl w:val="0"/>
+          <w:numId w:val="20"/>
+        </w:numPr>
+        <w:rPr>
+          <w:ins w:id="53" w:author="Manfred Theißen" w:date="2025-08-18T17:54:00Z" w16du:dateUtc="2025-08-18T15:54:00Z"/>
+        </w:rPr>
+      </w:pPr>
+      <w:ins w:id="54" w:author="Manfred Theißen" w:date="2025-08-18T17:55:00Z" w16du:dateUtc="2025-08-18T15:55:00Z">
+        <w:r>
+          <w:t>weighting</w:t>
+        </w:r>
+      </w:ins>
+    </w:p>
+    <w:p>
+      <w:pPr>
+        <w:pStyle w:val="Textkrper"/>
+        <w:rPr>
+          <w:ins w:id="55" w:author="Manfred Theißen" w:date="2025-08-18T17:54:00Z" w16du:dateUtc="2025-08-18T15:54:00Z"/>
+        </w:rPr>
+      </w:pPr>
+    </w:p>
+    <w:p>
+      <w:pPr>
+        <w:pStyle w:val="Textkrper"/>
+        <w:rPr>
+          <w:ins w:id="56" w:author="Manfred Theißen" w:date="2025-08-18T17:48:00Z" w16du:dateUtc="2025-08-18T15:48:00Z"/>
+        </w:rPr>
+        <w:pPrChange w:id="57" w:author="Manfred Theißen" w:date="2025-08-18T17:54:00Z" w16du:dateUtc="2025-08-18T15:54:00Z">
+          <w:pPr>
+            <w:pStyle w:val="Textkrper"/>
+            <w:numPr>
+              <w:numId w:val="27"/>
+            </w:numPr>
+            <w:ind w:left="981" w:hanging="360"/>
+          </w:pPr>
+        </w:pPrChange>
+      </w:pPr>
+    </w:p>
+    <w:p>
+      <w:pPr>
+        <w:pStyle w:val="Textkrper"/>
+        <w:rPr>
+          <w:ins w:id="58" w:author="Manfred Theißen" w:date="2025-08-18T17:48:00Z" w16du:dateUtc="2025-08-18T15:48:00Z"/>
+        </w:rPr>
+        <w:pPrChange w:id="59" w:author="Manfred Theißen" w:date="2025-08-18T17:48:00Z" w16du:dateUtc="2025-08-18T15:48:00Z">
+          <w:pPr>
+            <w:pStyle w:val="Textkrper"/>
+            <w:numPr>
+              <w:numId w:val="27"/>
+            </w:numPr>
+            <w:ind w:left="981" w:hanging="360"/>
+          </w:pPr>
+        </w:pPrChange>
+      </w:pPr>
+    </w:p>
+    <w:p>
+      <w:pPr>
+        <w:pStyle w:val="Textkrper"/>
+        <w:ind w:left="621"/>
+        <w:rPr>
+          <w:ins w:id="60" w:author="Manfred Theißen" w:date="2025-08-18T17:47:00Z" w16du:dateUtc="2025-08-18T15:47:00Z"/>
+        </w:rPr>
+        <w:pPrChange w:id="61" w:author="Manfred Theißen" w:date="2025-08-18T17:48:00Z" w16du:dateUtc="2025-08-18T15:48:00Z">
+          <w:pPr>
+            <w:pStyle w:val="Textkrper"/>
+          </w:pPr>
+        </w:pPrChange>
+      </w:pPr>
+    </w:p>
+    <w:p>
+      <w:pPr>
+        <w:pStyle w:val="Textkrper"/>
+        <w:rPr>
+          <w:ins w:id="62" w:author="Manfred Theißen" w:date="2025-08-18T17:39:00Z" w16du:dateUtc="2025-08-18T15:39:00Z"/>
+        </w:rPr>
+        <w:pPrChange w:id="63" w:author="Manfred Theißen" w:date="2025-08-18T17:46:00Z" w16du:dateUtc="2025-08-18T15:46:00Z">
+          <w:pPr>
+            <w:pStyle w:val="Textkrper"/>
+            <w:numPr>
+              <w:numId w:val="20"/>
+            </w:numPr>
+            <w:ind w:left="981" w:hanging="360"/>
+          </w:pPr>
+        </w:pPrChange>
+      </w:pPr>
+    </w:p>
+    <w:p>
+      <w:pPr>
+        <w:pStyle w:val="Textkrper"/>
+        <w:ind w:left="981"/>
+      </w:pPr>
     </w:p>
     <w:p>
       <w:pPr>
@@ -8345,18 +8141,18 @@
     </w:p>
     <w:p>
       <w:pPr>
-        <w:pStyle w:val="Heading1"/>
-      </w:pPr>
-      <w:bookmarkStart w:id="18" w:name="_Toc206410183"/>
+        <w:pStyle w:val="berschrift1"/>
+      </w:pPr>
+      <w:bookmarkStart w:id="64" w:name="_Toc206410183"/>
       <w:r>
         <w:lastRenderedPageBreak/>
         <w:t>Out-of-Scope Gaps</w:t>
       </w:r>
-      <w:bookmarkEnd w:id="18"/>
-    </w:p>
-    <w:p>
-      <w:pPr>
-        <w:pStyle w:val="BodyText"/>
+      <w:bookmarkEnd w:id="64"/>
+    </w:p>
+    <w:p>
+      <w:pPr>
+        <w:pStyle w:val="Textkrper"/>
         <w:numPr>
           <w:ilvl w:val="1"/>
           <w:numId w:val="2"/>
@@ -8368,7 +8164,7 @@
     </w:p>
     <w:p>
       <w:pPr>
-        <w:pStyle w:val="BodyText"/>
+        <w:pStyle w:val="Textkrper"/>
         <w:numPr>
           <w:ilvl w:val="1"/>
           <w:numId w:val="2"/>
@@ -8380,7 +8176,7 @@
     </w:p>
     <w:p>
       <w:pPr>
-        <w:pStyle w:val="BodyText"/>
+        <w:pStyle w:val="Textkrper"/>
         <w:numPr>
           <w:ilvl w:val="1"/>
           <w:numId w:val="2"/>
@@ -8427,7 +8223,7 @@
 <w:ftr xmlns:wpc="http://schemas.microsoft.com/office/word/2010/wordprocessingCanvas" xmlns:cx="http://schemas.microsoft.com/office/drawing/2014/chartex" xmlns:cx1="http://schemas.microsoft.com/office/drawing/2015/9/8/chartex" xmlns:cx2="http://schemas.microsoft.com/office/drawing/2015/10/21/chartex" xmlns:cx3="http://schemas.microsoft.com/office/drawing/2016/5/9/chartex" xmlns:cx4="http://schemas.microsoft.com/office/drawing/2016/5/10/chartex" xmlns:cx5="http://schemas.microsoft.com/office/drawing/2016/5/11/chartex" xmlns:cx6="http://schemas.microsoft.com/office/drawing/2016/5/12/chartex" xmlns:cx7="http://schemas.microsoft.com/office/drawing/2016/5/13/chartex" xmlns:cx8="http://schemas.microsoft.com/office/drawing/2016/5/14/chartex" xmlns:mc="http://schemas.openxmlformats.org/markup-compatibility/2006" xmlns:aink="http://schemas.microsoft.com/office/drawing/2016/ink" xmlns:am3d="http://schemas.microsoft.com/office/drawing/2017/model3d" xmlns:o="urn:schemas-microsoft-com:office:office" xmlns:oel="http://schemas.microsoft.com/office/2019/extlst" xmlns:r="http://schemas.openxmlformats.org/officeDocument/2006/relationships" xmlns:m="http://schemas.openxmlformats.org/officeDocument/2006/math" xmlns:v="urn:schemas-microsoft-com:vml" xmlns:wp14="http://schemas.microsoft.com/office/word/2010/wordprocessingDrawing" xmlns:wp="http://schemas.openxmlformats.org/drawingml/2006/wordprocessingDrawing" xmlns:w10="urn:schemas-microsoft-com:office:word" xmlns:w="http://schemas.openxmlformats.org/wordprocessingml/2006/main" xmlns:w14="http://schemas.microsoft.com/office/word/2010/wordml" xmlns:w15="http://schemas.microsoft.com/office/word/2012/wordml" xmlns:w16cex="http://schemas.microsoft.com/office/word/2018/wordml/cex" xmlns:w16cid="http://schemas.microsoft.com/office/word/2016/wordml/cid" xmlns:w16="http://schemas.microsoft.com/office/word/2018/wordml" xmlns:w16du="http://schemas.microsoft.com/office/word/2023/wordml/word16du" xmlns:w16sdtdh="http://schemas.microsoft.com/office/word/2020/wordml/sdtdatahash" xmlns:w16sdtfl="http://schemas.microsoft.com/office/word/2024/wordml/sdtformatlock" xmlns:w16se="http://schemas.microsoft.com/office/word/2015/wordml/symex" xmlns:wpg="http://schemas.microsoft.com/office/word/2010/wordprocessingGroup" xmlns:wpi="http://schemas.microsoft.com/office/word/2010/wordprocessingInk" xmlns:wne="http://schemas.microsoft.com/office/word/2006/wordml" xmlns:wps="http://schemas.microsoft.com/office/word/2010/wordprocessingShape" mc:Ignorable="w14 w15 w16se w16cid w16 w16cex w16sdtdh w16sdtfl w16du wp14">
   <w:p>
     <w:pPr>
-      <w:pStyle w:val="BodyText"/>
+      <w:pStyle w:val="Textkrper"/>
       <w:rPr>
         <w:sz w:val="20"/>
       </w:rPr>
@@ -8945,7 +8741,7 @@
   </w:tbl>
   <w:p>
     <w:pPr>
-      <w:pStyle w:val="Header"/>
+      <w:pStyle w:val="Kopfzeile"/>
       <w:rPr>
         <w:sz w:val="24"/>
         <w:szCs w:val="24"/>
@@ -9757,7 +9553,7 @@
     <w:lvl w:ilvl="0">
       <w:start w:val="1"/>
       <w:numFmt w:val="decimal"/>
-      <w:pStyle w:val="Heading1"/>
+      <w:pStyle w:val="berschrift1"/>
       <w:lvlText w:val="%1"/>
       <w:lvlJc w:val="left"/>
       <w:pPr>
@@ -9767,7 +9563,7 @@
     <w:lvl w:ilvl="1">
       <w:start w:val="1"/>
       <w:numFmt w:val="decimal"/>
-      <w:pStyle w:val="Heading2"/>
+      <w:pStyle w:val="berschrift2"/>
       <w:lvlText w:val="%1.%2"/>
       <w:lvlJc w:val="left"/>
       <w:pPr>
@@ -9777,7 +9573,7 @@
     <w:lvl w:ilvl="2">
       <w:start w:val="1"/>
       <w:numFmt w:val="decimal"/>
-      <w:pStyle w:val="Heading3"/>
+      <w:pStyle w:val="berschrift3"/>
       <w:lvlText w:val="%1.%2.%3"/>
       <w:lvlJc w:val="left"/>
       <w:pPr>
@@ -9787,7 +9583,7 @@
     <w:lvl w:ilvl="3">
       <w:start w:val="1"/>
       <w:numFmt w:val="decimal"/>
-      <w:pStyle w:val="Heading4"/>
+      <w:pStyle w:val="berschrift4"/>
       <w:lvlText w:val="%1.%2.%3.%4"/>
       <w:lvlJc w:val="left"/>
       <w:pPr>
@@ -9797,7 +9593,7 @@
     <w:lvl w:ilvl="4">
       <w:start w:val="1"/>
       <w:numFmt w:val="decimal"/>
-      <w:pStyle w:val="Heading5"/>
+      <w:pStyle w:val="berschrift5"/>
       <w:lvlText w:val="%1.%2.%3.%4.%5"/>
       <w:lvlJc w:val="left"/>
       <w:pPr>
@@ -9807,7 +9603,7 @@
     <w:lvl w:ilvl="5">
       <w:start w:val="1"/>
       <w:numFmt w:val="decimal"/>
-      <w:pStyle w:val="Heading6"/>
+      <w:pStyle w:val="berschrift6"/>
       <w:lvlText w:val="%1.%2.%3.%4.%5.%6"/>
       <w:lvlJc w:val="left"/>
       <w:pPr>
@@ -9817,7 +9613,7 @@
     <w:lvl w:ilvl="6">
       <w:start w:val="1"/>
       <w:numFmt w:val="decimal"/>
-      <w:pStyle w:val="Heading7"/>
+      <w:pStyle w:val="berschrift7"/>
       <w:lvlText w:val="%1.%2.%3.%4.%5.%6.%7"/>
       <w:lvlJc w:val="left"/>
       <w:pPr>
@@ -9827,7 +9623,7 @@
     <w:lvl w:ilvl="7">
       <w:start w:val="1"/>
       <w:numFmt w:val="decimal"/>
-      <w:pStyle w:val="Heading8"/>
+      <w:pStyle w:val="berschrift8"/>
       <w:lvlText w:val="%1.%2.%3.%4.%5.%6.%7.%8"/>
       <w:lvlJc w:val="left"/>
       <w:pPr>
@@ -9837,7 +9633,7 @@
     <w:lvl w:ilvl="8">
       <w:start w:val="1"/>
       <w:numFmt w:val="decimal"/>
-      <w:pStyle w:val="Heading9"/>
+      <w:pStyle w:val="berschrift9"/>
       <w:lvlText w:val="%1.%2.%3.%4.%5.%6.%7.%8.%9"/>
       <w:lvlJc w:val="left"/>
       <w:pPr>
@@ -11972,6 +11768,119 @@
       <w:pPr>
         <w:ind w:left="6741" w:hanging="180"/>
       </w:pPr>
+    </w:lvl>
+  </w:abstractNum>
+  <w:abstractNum w:abstractNumId="26" w15:restartNumberingAfterBreak="0">
+    <w:nsid w:val="7EC776E2"/>
+    <w:multiLevelType w:val="hybridMultilevel"/>
+    <w:tmpl w:val="FEBACC74"/>
+    <w:lvl w:ilvl="0" w:tplc="04070001">
+      <w:start w:val="1"/>
+      <w:numFmt w:val="bullet"/>
+      <w:lvlText w:val=""/>
+      <w:lvlJc w:val="left"/>
+      <w:pPr>
+        <w:ind w:left="981" w:hanging="360"/>
+      </w:pPr>
+      <w:rPr>
+        <w:rFonts w:ascii="Symbol" w:hAnsi="Symbol" w:hint="default"/>
+      </w:rPr>
+    </w:lvl>
+    <w:lvl w:ilvl="1" w:tplc="04070003" w:tentative="1">
+      <w:start w:val="1"/>
+      <w:numFmt w:val="bullet"/>
+      <w:lvlText w:val="o"/>
+      <w:lvlJc w:val="left"/>
+      <w:pPr>
+        <w:ind w:left="1701" w:hanging="360"/>
+      </w:pPr>
+      <w:rPr>
+        <w:rFonts w:ascii="Courier New" w:hAnsi="Courier New" w:cs="Courier New" w:hint="default"/>
+      </w:rPr>
+    </w:lvl>
+    <w:lvl w:ilvl="2" w:tplc="04070005" w:tentative="1">
+      <w:start w:val="1"/>
+      <w:numFmt w:val="bullet"/>
+      <w:lvlText w:val=""/>
+      <w:lvlJc w:val="left"/>
+      <w:pPr>
+        <w:ind w:left="2421" w:hanging="360"/>
+      </w:pPr>
+      <w:rPr>
+        <w:rFonts w:ascii="Wingdings" w:hAnsi="Wingdings" w:hint="default"/>
+      </w:rPr>
+    </w:lvl>
+    <w:lvl w:ilvl="3" w:tplc="04070001" w:tentative="1">
+      <w:start w:val="1"/>
+      <w:numFmt w:val="bullet"/>
+      <w:lvlText w:val=""/>
+      <w:lvlJc w:val="left"/>
+      <w:pPr>
+        <w:ind w:left="3141" w:hanging="360"/>
+      </w:pPr>
+      <w:rPr>
+        <w:rFonts w:ascii="Symbol" w:hAnsi="Symbol" w:hint="default"/>
+      </w:rPr>
+    </w:lvl>
+    <w:lvl w:ilvl="4" w:tplc="04070003" w:tentative="1">
+      <w:start w:val="1"/>
+      <w:numFmt w:val="bullet"/>
+      <w:lvlText w:val="o"/>
+      <w:lvlJc w:val="left"/>
+      <w:pPr>
+        <w:ind w:left="3861" w:hanging="360"/>
+      </w:pPr>
+      <w:rPr>
+        <w:rFonts w:ascii="Courier New" w:hAnsi="Courier New" w:cs="Courier New" w:hint="default"/>
+      </w:rPr>
+    </w:lvl>
+    <w:lvl w:ilvl="5" w:tplc="04070005" w:tentative="1">
+      <w:start w:val="1"/>
+      <w:numFmt w:val="bullet"/>
+      <w:lvlText w:val=""/>
+      <w:lvlJc w:val="left"/>
+      <w:pPr>
+        <w:ind w:left="4581" w:hanging="360"/>
+      </w:pPr>
+      <w:rPr>
+        <w:rFonts w:ascii="Wingdings" w:hAnsi="Wingdings" w:hint="default"/>
+      </w:rPr>
+    </w:lvl>
+    <w:lvl w:ilvl="6" w:tplc="04070001" w:tentative="1">
+      <w:start w:val="1"/>
+      <w:numFmt w:val="bullet"/>
+      <w:lvlText w:val=""/>
+      <w:lvlJc w:val="left"/>
+      <w:pPr>
+        <w:ind w:left="5301" w:hanging="360"/>
+      </w:pPr>
+      <w:rPr>
+        <w:rFonts w:ascii="Symbol" w:hAnsi="Symbol" w:hint="default"/>
+      </w:rPr>
+    </w:lvl>
+    <w:lvl w:ilvl="7" w:tplc="04070003" w:tentative="1">
+      <w:start w:val="1"/>
+      <w:numFmt w:val="bullet"/>
+      <w:lvlText w:val="o"/>
+      <w:lvlJc w:val="left"/>
+      <w:pPr>
+        <w:ind w:left="6021" w:hanging="360"/>
+      </w:pPr>
+      <w:rPr>
+        <w:rFonts w:ascii="Courier New" w:hAnsi="Courier New" w:cs="Courier New" w:hint="default"/>
+      </w:rPr>
+    </w:lvl>
+    <w:lvl w:ilvl="8" w:tplc="04070005" w:tentative="1">
+      <w:start w:val="1"/>
+      <w:numFmt w:val="bullet"/>
+      <w:lvlText w:val=""/>
+      <w:lvlJc w:val="left"/>
+      <w:pPr>
+        <w:ind w:left="6741" w:hanging="360"/>
+      </w:pPr>
+      <w:rPr>
+        <w:rFonts w:ascii="Wingdings" w:hAnsi="Wingdings" w:hint="default"/>
+      </w:rPr>
     </w:lvl>
   </w:abstractNum>
   <w:num w:numId="1" w16cid:durableId="474761354">
@@ -12052,8 +11961,19 @@
   <w:num w:numId="26" w16cid:durableId="1443263592">
     <w:abstractNumId w:val="0"/>
   </w:num>
+  <w:num w:numId="27" w16cid:durableId="216161252">
+    <w:abstractNumId w:val="26"/>
+  </w:num>
   <w:numIdMacAtCleanup w:val="13"/>
 </w:numbering>
+</file>
+
+<file path=word/people.xml><?xml version="1.0" encoding="utf-8"?>
+<w15:people xmlns:wpc="http://schemas.microsoft.com/office/word/2010/wordprocessingCanvas" xmlns:cx="http://schemas.microsoft.com/office/drawing/2014/chartex" xmlns:cx1="http://schemas.microsoft.com/office/drawing/2015/9/8/chartex" xmlns:cx2="http://schemas.microsoft.com/office/drawing/2015/10/21/chartex" xmlns:cx3="http://schemas.microsoft.com/office/drawing/2016/5/9/chartex" xmlns:cx4="http://schemas.microsoft.com/office/drawing/2016/5/10/chartex" xmlns:cx5="http://schemas.microsoft.com/office/drawing/2016/5/11/chartex" xmlns:cx6="http://schemas.microsoft.com/office/drawing/2016/5/12/chartex" xmlns:cx7="http://schemas.microsoft.com/office/drawing/2016/5/13/chartex" xmlns:cx8="http://schemas.microsoft.com/office/drawing/2016/5/14/chartex" xmlns:mc="http://schemas.openxmlformats.org/markup-compatibility/2006" xmlns:aink="http://schemas.microsoft.com/office/drawing/2016/ink" xmlns:am3d="http://schemas.microsoft.com/office/drawing/2017/model3d" xmlns:o="urn:schemas-microsoft-com:office:office" xmlns:oel="http://schemas.microsoft.com/office/2019/extlst" xmlns:r="http://schemas.openxmlformats.org/officeDocument/2006/relationships" xmlns:m="http://schemas.openxmlformats.org/officeDocument/2006/math" xmlns:v="urn:schemas-microsoft-com:vml" xmlns:wp14="http://schemas.microsoft.com/office/word/2010/wordprocessingDrawing" xmlns:wp="http://schemas.openxmlformats.org/drawingml/2006/wordprocessingDrawing" xmlns:w10="urn:schemas-microsoft-com:office:word" xmlns:w="http://schemas.openxmlformats.org/wordprocessingml/2006/main" xmlns:w14="http://schemas.microsoft.com/office/word/2010/wordml" xmlns:w15="http://schemas.microsoft.com/office/word/2012/wordml" xmlns:w16cex="http://schemas.microsoft.com/office/word/2018/wordml/cex" xmlns:w16cid="http://schemas.microsoft.com/office/word/2016/wordml/cid" xmlns:w16="http://schemas.microsoft.com/office/word/2018/wordml" xmlns:w16du="http://schemas.microsoft.com/office/word/2023/wordml/word16du" xmlns:w16sdtdh="http://schemas.microsoft.com/office/word/2020/wordml/sdtdatahash" xmlns:w16sdtfl="http://schemas.microsoft.com/office/word/2024/wordml/sdtformatlock" xmlns:w16se="http://schemas.microsoft.com/office/word/2015/wordml/symex" xmlns:wpg="http://schemas.microsoft.com/office/word/2010/wordprocessingGroup" xmlns:wpi="http://schemas.microsoft.com/office/word/2010/wordprocessingInk" xmlns:wne="http://schemas.microsoft.com/office/word/2006/wordml" xmlns:wps="http://schemas.microsoft.com/office/word/2010/wordprocessingShape" mc:Ignorable="w14 w15 w16se w16cid w16 w16cex w16sdtdh w16sdtfl w16du wp14">
+  <w15:person w15:author="Manfred Theißen">
+    <w15:presenceInfo w15:providerId="AD" w15:userId="S::theissen@plants-and-bytes.de::88ce9eb9-76f9-44ba-9a05-beac16cbbdf5"/>
+  </w15:person>
+</w15:people>
 </file>
 
 <file path=word/styles.xml><?xml version="1.0" encoding="utf-8"?>
@@ -12453,16 +12373,16 @@
     <w:lsdException w:name="Unresolved Mention" w:semiHidden="1" w:unhideWhenUsed="1"/>
     <w:lsdException w:name="Smart Link" w:semiHidden="1" w:unhideWhenUsed="1"/>
   </w:latentStyles>
-  <w:style w:type="paragraph" w:default="1" w:styleId="Normal">
+  <w:style w:type="paragraph" w:default="1" w:styleId="Standard">
     <w:name w:val="Normal"/>
     <w:qFormat/>
     <w:rPr>
       <w:rFonts w:ascii="Arial" w:eastAsia="Arial" w:hAnsi="Arial" w:cs="Arial"/>
     </w:rPr>
   </w:style>
-  <w:style w:type="paragraph" w:styleId="Heading1">
+  <w:style w:type="paragraph" w:styleId="berschrift1">
     <w:name w:val="heading 1"/>
-    <w:basedOn w:val="Normal"/>
+    <w:basedOn w:val="Standard"/>
     <w:uiPriority w:val="9"/>
     <w:qFormat/>
     <w:rsid w:val="00B7166D"/>
@@ -12484,9 +12404,9 @@
       <w:szCs w:val="28"/>
     </w:rPr>
   </w:style>
-  <w:style w:type="paragraph" w:styleId="Heading2">
+  <w:style w:type="paragraph" w:styleId="berschrift2">
     <w:name w:val="heading 2"/>
-    <w:basedOn w:val="Normal"/>
+    <w:basedOn w:val="Standard"/>
     <w:uiPriority w:val="9"/>
     <w:unhideWhenUsed/>
     <w:qFormat/>
@@ -12509,9 +12429,9 @@
       <w:szCs w:val="24"/>
     </w:rPr>
   </w:style>
-  <w:style w:type="paragraph" w:styleId="Heading3">
+  <w:style w:type="paragraph" w:styleId="berschrift3">
     <w:name w:val="heading 3"/>
-    <w:basedOn w:val="Normal"/>
+    <w:basedOn w:val="Standard"/>
     <w:uiPriority w:val="9"/>
     <w:unhideWhenUsed/>
     <w:qFormat/>
@@ -12530,11 +12450,11 @@
       <w:bCs/>
     </w:rPr>
   </w:style>
-  <w:style w:type="paragraph" w:styleId="Heading4">
+  <w:style w:type="paragraph" w:styleId="berschrift4">
     <w:name w:val="heading 4"/>
-    <w:basedOn w:val="Normal"/>
-    <w:next w:val="Normal"/>
-    <w:link w:val="Heading4Char"/>
+    <w:basedOn w:val="Standard"/>
+    <w:next w:val="Standard"/>
+    <w:link w:val="berschrift4Zchn"/>
     <w:uiPriority w:val="9"/>
     <w:semiHidden/>
     <w:unhideWhenUsed/>
@@ -12561,11 +12481,11 @@
       <w:color w:val="365F91" w:themeColor="accent1" w:themeShade="BF"/>
     </w:rPr>
   </w:style>
-  <w:style w:type="paragraph" w:styleId="Heading5">
+  <w:style w:type="paragraph" w:styleId="berschrift5">
     <w:name w:val="heading 5"/>
-    <w:basedOn w:val="Normal"/>
-    <w:next w:val="Normal"/>
-    <w:link w:val="Heading5Char"/>
+    <w:basedOn w:val="Standard"/>
+    <w:next w:val="Standard"/>
+    <w:link w:val="berschrift5Zchn"/>
     <w:uiPriority w:val="9"/>
     <w:semiHidden/>
     <w:unhideWhenUsed/>
@@ -12590,11 +12510,11 @@
       <w:color w:val="365F91" w:themeColor="accent1" w:themeShade="BF"/>
     </w:rPr>
   </w:style>
-  <w:style w:type="paragraph" w:styleId="Heading6">
+  <w:style w:type="paragraph" w:styleId="berschrift6">
     <w:name w:val="heading 6"/>
-    <w:basedOn w:val="Normal"/>
-    <w:next w:val="Normal"/>
-    <w:link w:val="Heading6Char"/>
+    <w:basedOn w:val="Standard"/>
+    <w:next w:val="Standard"/>
+    <w:link w:val="berschrift6Zchn"/>
     <w:uiPriority w:val="9"/>
     <w:semiHidden/>
     <w:unhideWhenUsed/>
@@ -12619,11 +12539,11 @@
       <w:color w:val="243F60" w:themeColor="accent1" w:themeShade="7F"/>
     </w:rPr>
   </w:style>
-  <w:style w:type="paragraph" w:styleId="Heading7">
+  <w:style w:type="paragraph" w:styleId="berschrift7">
     <w:name w:val="heading 7"/>
-    <w:basedOn w:val="Normal"/>
-    <w:next w:val="Normal"/>
-    <w:link w:val="Heading7Char"/>
+    <w:basedOn w:val="Standard"/>
+    <w:next w:val="Standard"/>
+    <w:link w:val="berschrift7Zchn"/>
     <w:uiPriority w:val="9"/>
     <w:semiHidden/>
     <w:unhideWhenUsed/>
@@ -12650,11 +12570,11 @@
       <w:color w:val="243F60" w:themeColor="accent1" w:themeShade="7F"/>
     </w:rPr>
   </w:style>
-  <w:style w:type="paragraph" w:styleId="Heading8">
+  <w:style w:type="paragraph" w:styleId="berschrift8">
     <w:name w:val="heading 8"/>
-    <w:basedOn w:val="Normal"/>
-    <w:next w:val="Normal"/>
-    <w:link w:val="Heading8Char"/>
+    <w:basedOn w:val="Standard"/>
+    <w:next w:val="Standard"/>
+    <w:link w:val="berschrift8Zchn"/>
     <w:uiPriority w:val="9"/>
     <w:semiHidden/>
     <w:unhideWhenUsed/>
@@ -12681,11 +12601,11 @@
       <w:szCs w:val="21"/>
     </w:rPr>
   </w:style>
-  <w:style w:type="paragraph" w:styleId="Heading9">
+  <w:style w:type="paragraph" w:styleId="berschrift9">
     <w:name w:val="heading 9"/>
-    <w:basedOn w:val="Normal"/>
-    <w:next w:val="Normal"/>
-    <w:link w:val="Heading9Char"/>
+    <w:basedOn w:val="Standard"/>
+    <w:next w:val="Standard"/>
+    <w:link w:val="berschrift9Zchn"/>
     <w:uiPriority w:val="9"/>
     <w:semiHidden/>
     <w:unhideWhenUsed/>
@@ -12714,13 +12634,13 @@
       <w:szCs w:val="21"/>
     </w:rPr>
   </w:style>
-  <w:style w:type="character" w:default="1" w:styleId="DefaultParagraphFont">
+  <w:style w:type="character" w:default="1" w:styleId="Absatz-Standardschriftart">
     <w:name w:val="Default Paragraph Font"/>
     <w:uiPriority w:val="1"/>
     <w:semiHidden/>
     <w:unhideWhenUsed/>
   </w:style>
-  <w:style w:type="table" w:default="1" w:styleId="TableNormal">
+  <w:style w:type="table" w:default="1" w:styleId="NormaleTabelle">
     <w:name w:val="Normal Table"/>
     <w:uiPriority w:val="99"/>
     <w:semiHidden/>
@@ -12735,15 +12655,15 @@
       </w:tblCellMar>
     </w:tblPr>
   </w:style>
-  <w:style w:type="numbering" w:default="1" w:styleId="NoList">
+  <w:style w:type="numbering" w:default="1" w:styleId="KeineListe">
     <w:name w:val="No List"/>
     <w:uiPriority w:val="99"/>
     <w:semiHidden/>
     <w:unhideWhenUsed/>
   </w:style>
-  <w:style w:type="paragraph" w:styleId="TOC1">
+  <w:style w:type="paragraph" w:styleId="Verzeichnis1">
     <w:name w:val="toc 1"/>
-    <w:basedOn w:val="Normal"/>
+    <w:basedOn w:val="Standard"/>
     <w:uiPriority w:val="39"/>
     <w:qFormat/>
     <w:pPr>
@@ -12756,9 +12676,9 @@
       <w:szCs w:val="24"/>
     </w:rPr>
   </w:style>
-  <w:style w:type="paragraph" w:styleId="TOC2">
+  <w:style w:type="paragraph" w:styleId="Verzeichnis2">
     <w:name w:val="toc 2"/>
-    <w:basedOn w:val="Normal"/>
+    <w:basedOn w:val="Standard"/>
     <w:uiPriority w:val="39"/>
     <w:qFormat/>
     <w:pPr>
@@ -12766,9 +12686,9 @@
       <w:ind w:left="1248" w:hanging="852"/>
     </w:pPr>
   </w:style>
-  <w:style w:type="paragraph" w:styleId="TOC3">
+  <w:style w:type="paragraph" w:styleId="Verzeichnis3">
     <w:name w:val="toc 3"/>
-    <w:basedOn w:val="Normal"/>
+    <w:basedOn w:val="Standard"/>
     <w:uiPriority w:val="39"/>
     <w:qFormat/>
     <w:pPr>
@@ -12780,10 +12700,10 @@
       <w:szCs w:val="20"/>
     </w:rPr>
   </w:style>
-  <w:style w:type="paragraph" w:styleId="BodyText">
+  <w:style w:type="paragraph" w:styleId="Textkrper">
     <w:name w:val="Body Text"/>
-    <w:basedOn w:val="Normal"/>
-    <w:link w:val="BodyTextChar"/>
+    <w:basedOn w:val="Standard"/>
+    <w:link w:val="TextkrperZchn"/>
     <w:uiPriority w:val="1"/>
     <w:qFormat/>
     <w:rsid w:val="003844DB"/>
@@ -12795,9 +12715,9 @@
       <w:lang w:val="en-GB"/>
     </w:rPr>
   </w:style>
-  <w:style w:type="paragraph" w:styleId="ListParagraph">
+  <w:style w:type="paragraph" w:styleId="Listenabsatz">
     <w:name w:val="List Paragraph"/>
-    <w:basedOn w:val="Normal"/>
+    <w:basedOn w:val="Standard"/>
     <w:uiPriority w:val="34"/>
     <w:qFormat/>
     <w:pPr>
@@ -12806,13 +12726,13 @@
   </w:style>
   <w:style w:type="paragraph" w:customStyle="1" w:styleId="TableParagraph">
     <w:name w:val="Table Paragraph"/>
-    <w:basedOn w:val="Normal"/>
+    <w:basedOn w:val="Standard"/>
     <w:uiPriority w:val="1"/>
     <w:qFormat/>
   </w:style>
-  <w:style w:type="character" w:styleId="PlaceholderText">
+  <w:style w:type="character" w:styleId="Platzhaltertext">
     <w:name w:val="Placeholder Text"/>
-    <w:basedOn w:val="DefaultParagraphFont"/>
+    <w:basedOn w:val="Absatz-Standardschriftart"/>
     <w:uiPriority w:val="99"/>
     <w:semiHidden/>
     <w:rsid w:val="00A252F3"/>
@@ -12820,10 +12740,10 @@
       <w:color w:val="666666"/>
     </w:rPr>
   </w:style>
-  <w:style w:type="paragraph" w:styleId="Header">
+  <w:style w:type="paragraph" w:styleId="Kopfzeile">
     <w:name w:val="header"/>
-    <w:basedOn w:val="Normal"/>
-    <w:link w:val="HeaderChar"/>
+    <w:basedOn w:val="Standard"/>
+    <w:link w:val="KopfzeileZchn"/>
     <w:uiPriority w:val="99"/>
     <w:unhideWhenUsed/>
     <w:rsid w:val="00040A3D"/>
@@ -12834,20 +12754,20 @@
       </w:tabs>
     </w:pPr>
   </w:style>
-  <w:style w:type="character" w:customStyle="1" w:styleId="HeaderChar">
-    <w:name w:val="Header Char"/>
-    <w:basedOn w:val="DefaultParagraphFont"/>
-    <w:link w:val="Header"/>
+  <w:style w:type="character" w:customStyle="1" w:styleId="KopfzeileZchn">
+    <w:name w:val="Kopfzeile Zchn"/>
+    <w:basedOn w:val="Absatz-Standardschriftart"/>
+    <w:link w:val="Kopfzeile"/>
     <w:uiPriority w:val="99"/>
     <w:rsid w:val="00040A3D"/>
     <w:rPr>
       <w:rFonts w:ascii="Arial" w:eastAsia="Arial" w:hAnsi="Arial" w:cs="Arial"/>
     </w:rPr>
   </w:style>
-  <w:style w:type="paragraph" w:styleId="Footer">
+  <w:style w:type="paragraph" w:styleId="Fuzeile">
     <w:name w:val="footer"/>
-    <w:basedOn w:val="Normal"/>
-    <w:link w:val="FooterChar"/>
+    <w:basedOn w:val="Standard"/>
+    <w:link w:val="FuzeileZchn"/>
     <w:uiPriority w:val="99"/>
     <w:unhideWhenUsed/>
     <w:rsid w:val="00040A3D"/>
@@ -12858,10 +12778,10 @@
       </w:tabs>
     </w:pPr>
   </w:style>
-  <w:style w:type="character" w:customStyle="1" w:styleId="FooterChar">
-    <w:name w:val="Footer Char"/>
-    <w:basedOn w:val="DefaultParagraphFont"/>
-    <w:link w:val="Footer"/>
+  <w:style w:type="character" w:customStyle="1" w:styleId="FuzeileZchn">
+    <w:name w:val="Fußzeile Zchn"/>
+    <w:basedOn w:val="Absatz-Standardschriftart"/>
+    <w:link w:val="Fuzeile"/>
     <w:uiPriority w:val="99"/>
     <w:rsid w:val="00040A3D"/>
     <w:rPr>
@@ -12870,7 +12790,7 @@
   </w:style>
   <w:style w:type="character" w:styleId="Hyperlink">
     <w:name w:val="Hyperlink"/>
-    <w:basedOn w:val="DefaultParagraphFont"/>
+    <w:basedOn w:val="Absatz-Standardschriftart"/>
     <w:uiPriority w:val="99"/>
     <w:unhideWhenUsed/>
     <w:rsid w:val="00F11C69"/>
@@ -12879,9 +12799,9 @@
       <w:u w:val="single"/>
     </w:rPr>
   </w:style>
-  <w:style w:type="paragraph" w:styleId="TOC4">
+  <w:style w:type="paragraph" w:styleId="Verzeichnis4">
     <w:name w:val="toc 4"/>
-    <w:basedOn w:val="Normal"/>
+    <w:basedOn w:val="Standard"/>
     <w:uiPriority w:val="39"/>
     <w:qFormat/>
     <w:rsid w:val="00DE2681"/>
@@ -12896,10 +12816,10 @@
       <w:szCs w:val="24"/>
     </w:rPr>
   </w:style>
-  <w:style w:type="paragraph" w:styleId="Caption">
+  <w:style w:type="paragraph" w:styleId="Beschriftung">
     <w:name w:val="caption"/>
-    <w:basedOn w:val="Normal"/>
-    <w:next w:val="Normal"/>
+    <w:basedOn w:val="Standard"/>
+    <w:next w:val="Standard"/>
     <w:uiPriority w:val="35"/>
     <w:unhideWhenUsed/>
     <w:qFormat/>
@@ -12916,10 +12836,10 @@
       <w:szCs w:val="18"/>
     </w:rPr>
   </w:style>
-  <w:style w:type="paragraph" w:styleId="TOCHeading">
+  <w:style w:type="paragraph" w:styleId="Inhaltsverzeichnisberschrift">
     <w:name w:val="TOC Heading"/>
-    <w:basedOn w:val="Heading1"/>
-    <w:next w:val="Normal"/>
+    <w:basedOn w:val="berschrift1"/>
+    <w:next w:val="Standard"/>
     <w:uiPriority w:val="39"/>
     <w:unhideWhenUsed/>
     <w:qFormat/>
@@ -12949,10 +12869,10 @@
       <w:szCs w:val="32"/>
     </w:rPr>
   </w:style>
-  <w:style w:type="paragraph" w:styleId="TOC5">
+  <w:style w:type="paragraph" w:styleId="Verzeichnis5">
     <w:name w:val="toc 5"/>
-    <w:basedOn w:val="Normal"/>
-    <w:next w:val="Normal"/>
+    <w:basedOn w:val="Standard"/>
+    <w:next w:val="Standard"/>
     <w:autoRedefine/>
     <w:uiPriority w:val="39"/>
     <w:unhideWhenUsed/>
@@ -12973,10 +12893,10 @@
       <w14:ligatures w14:val="standardContextual"/>
     </w:rPr>
   </w:style>
-  <w:style w:type="paragraph" w:styleId="TOC6">
+  <w:style w:type="paragraph" w:styleId="Verzeichnis6">
     <w:name w:val="toc 6"/>
-    <w:basedOn w:val="Normal"/>
-    <w:next w:val="Normal"/>
+    <w:basedOn w:val="Standard"/>
+    <w:next w:val="Standard"/>
     <w:autoRedefine/>
     <w:uiPriority w:val="39"/>
     <w:unhideWhenUsed/>
@@ -12997,10 +12917,10 @@
       <w14:ligatures w14:val="standardContextual"/>
     </w:rPr>
   </w:style>
-  <w:style w:type="paragraph" w:styleId="TOC7">
+  <w:style w:type="paragraph" w:styleId="Verzeichnis7">
     <w:name w:val="toc 7"/>
-    <w:basedOn w:val="Normal"/>
-    <w:next w:val="Normal"/>
+    <w:basedOn w:val="Standard"/>
+    <w:next w:val="Standard"/>
     <w:autoRedefine/>
     <w:uiPriority w:val="39"/>
     <w:unhideWhenUsed/>
@@ -13021,10 +12941,10 @@
       <w14:ligatures w14:val="standardContextual"/>
     </w:rPr>
   </w:style>
-  <w:style w:type="paragraph" w:styleId="TOC8">
+  <w:style w:type="paragraph" w:styleId="Verzeichnis8">
     <w:name w:val="toc 8"/>
-    <w:basedOn w:val="Normal"/>
-    <w:next w:val="Normal"/>
+    <w:basedOn w:val="Standard"/>
+    <w:next w:val="Standard"/>
     <w:autoRedefine/>
     <w:uiPriority w:val="39"/>
     <w:unhideWhenUsed/>
@@ -13045,10 +12965,10 @@
       <w14:ligatures w14:val="standardContextual"/>
     </w:rPr>
   </w:style>
-  <w:style w:type="paragraph" w:styleId="TOC9">
+  <w:style w:type="paragraph" w:styleId="Verzeichnis9">
     <w:name w:val="toc 9"/>
-    <w:basedOn w:val="Normal"/>
-    <w:next w:val="Normal"/>
+    <w:basedOn w:val="Standard"/>
+    <w:next w:val="Standard"/>
     <w:autoRedefine/>
     <w:uiPriority w:val="39"/>
     <w:unhideWhenUsed/>
@@ -13069,9 +12989,9 @@
       <w14:ligatures w14:val="standardContextual"/>
     </w:rPr>
   </w:style>
-  <w:style w:type="character" w:styleId="UnresolvedMention">
+  <w:style w:type="character" w:styleId="NichtaufgelsteErwhnung">
     <w:name w:val="Unresolved Mention"/>
-    <w:basedOn w:val="DefaultParagraphFont"/>
+    <w:basedOn w:val="Absatz-Standardschriftart"/>
     <w:uiPriority w:val="99"/>
     <w:semiHidden/>
     <w:unhideWhenUsed/>
@@ -13083,7 +13003,7 @@
   </w:style>
   <w:style w:type="paragraph" w:customStyle="1" w:styleId="HeaderText">
     <w:name w:val="HeaderText"/>
-    <w:basedOn w:val="Normal"/>
+    <w:basedOn w:val="Standard"/>
     <w:link w:val="HeaderTextChar"/>
     <w:qFormat/>
     <w:rsid w:val="00A12BA2"/>
@@ -13101,7 +13021,7 @@
   </w:style>
   <w:style w:type="character" w:customStyle="1" w:styleId="HeaderTextChar">
     <w:name w:val="HeaderText Char"/>
-    <w:basedOn w:val="DefaultParagraphFont"/>
+    <w:basedOn w:val="Absatz-Standardschriftart"/>
     <w:link w:val="HeaderText"/>
     <w:rsid w:val="00A12BA2"/>
     <w:rPr>
@@ -13113,10 +13033,10 @@
       <w:szCs w:val="28"/>
     </w:rPr>
   </w:style>
-  <w:style w:type="character" w:customStyle="1" w:styleId="Heading4Char">
-    <w:name w:val="Heading 4 Char"/>
-    <w:basedOn w:val="DefaultParagraphFont"/>
-    <w:link w:val="Heading4"/>
+  <w:style w:type="character" w:customStyle="1" w:styleId="berschrift4Zchn">
+    <w:name w:val="Überschrift 4 Zchn"/>
+    <w:basedOn w:val="Absatz-Standardschriftart"/>
+    <w:link w:val="berschrift4"/>
     <w:uiPriority w:val="9"/>
     <w:semiHidden/>
     <w:rsid w:val="00BB6024"/>
@@ -13127,10 +13047,10 @@
       <w:color w:val="365F91" w:themeColor="accent1" w:themeShade="BF"/>
     </w:rPr>
   </w:style>
-  <w:style w:type="character" w:customStyle="1" w:styleId="Heading5Char">
-    <w:name w:val="Heading 5 Char"/>
-    <w:basedOn w:val="DefaultParagraphFont"/>
-    <w:link w:val="Heading5"/>
+  <w:style w:type="character" w:customStyle="1" w:styleId="berschrift5Zchn">
+    <w:name w:val="Überschrift 5 Zchn"/>
+    <w:basedOn w:val="Absatz-Standardschriftart"/>
+    <w:link w:val="berschrift5"/>
     <w:uiPriority w:val="9"/>
     <w:semiHidden/>
     <w:rsid w:val="00BB6024"/>
@@ -13139,10 +13059,10 @@
       <w:color w:val="365F91" w:themeColor="accent1" w:themeShade="BF"/>
     </w:rPr>
   </w:style>
-  <w:style w:type="character" w:customStyle="1" w:styleId="Heading6Char">
-    <w:name w:val="Heading 6 Char"/>
-    <w:basedOn w:val="DefaultParagraphFont"/>
-    <w:link w:val="Heading6"/>
+  <w:style w:type="character" w:customStyle="1" w:styleId="berschrift6Zchn">
+    <w:name w:val="Überschrift 6 Zchn"/>
+    <w:basedOn w:val="Absatz-Standardschriftart"/>
+    <w:link w:val="berschrift6"/>
     <w:uiPriority w:val="9"/>
     <w:semiHidden/>
     <w:rsid w:val="00BB6024"/>
@@ -13151,10 +13071,10 @@
       <w:color w:val="243F60" w:themeColor="accent1" w:themeShade="7F"/>
     </w:rPr>
   </w:style>
-  <w:style w:type="character" w:customStyle="1" w:styleId="Heading7Char">
-    <w:name w:val="Heading 7 Char"/>
-    <w:basedOn w:val="DefaultParagraphFont"/>
-    <w:link w:val="Heading7"/>
+  <w:style w:type="character" w:customStyle="1" w:styleId="berschrift7Zchn">
+    <w:name w:val="Überschrift 7 Zchn"/>
+    <w:basedOn w:val="Absatz-Standardschriftart"/>
+    <w:link w:val="berschrift7"/>
     <w:uiPriority w:val="9"/>
     <w:semiHidden/>
     <w:rsid w:val="00BB6024"/>
@@ -13165,10 +13085,10 @@
       <w:color w:val="243F60" w:themeColor="accent1" w:themeShade="7F"/>
     </w:rPr>
   </w:style>
-  <w:style w:type="character" w:customStyle="1" w:styleId="Heading8Char">
-    <w:name w:val="Heading 8 Char"/>
-    <w:basedOn w:val="DefaultParagraphFont"/>
-    <w:link w:val="Heading8"/>
+  <w:style w:type="character" w:customStyle="1" w:styleId="berschrift8Zchn">
+    <w:name w:val="Überschrift 8 Zchn"/>
+    <w:basedOn w:val="Absatz-Standardschriftart"/>
+    <w:link w:val="berschrift8"/>
     <w:uiPriority w:val="9"/>
     <w:semiHidden/>
     <w:rsid w:val="00BB6024"/>
@@ -13179,10 +13099,10 @@
       <w:szCs w:val="21"/>
     </w:rPr>
   </w:style>
-  <w:style w:type="character" w:customStyle="1" w:styleId="Heading9Char">
-    <w:name w:val="Heading 9 Char"/>
-    <w:basedOn w:val="DefaultParagraphFont"/>
-    <w:link w:val="Heading9"/>
+  <w:style w:type="character" w:customStyle="1" w:styleId="berschrift9Zchn">
+    <w:name w:val="Überschrift 9 Zchn"/>
+    <w:basedOn w:val="Absatz-Standardschriftart"/>
+    <w:link w:val="berschrift9"/>
     <w:uiPriority w:val="9"/>
     <w:semiHidden/>
     <w:rsid w:val="00BB6024"/>
@@ -13197,7 +13117,7 @@
   </w:style>
   <w:style w:type="paragraph" w:customStyle="1" w:styleId="Reference">
     <w:name w:val="Reference"/>
-    <w:basedOn w:val="BodyText"/>
+    <w:basedOn w:val="Textkrper"/>
     <w:link w:val="ReferenceChar"/>
     <w:qFormat/>
     <w:rsid w:val="00FE425C"/>
@@ -13206,10 +13126,10 @@
       <w:ind w:left="274" w:right="216"/>
     </w:pPr>
   </w:style>
-  <w:style w:type="character" w:customStyle="1" w:styleId="BodyTextChar">
-    <w:name w:val="Body Text Char"/>
-    <w:basedOn w:val="DefaultParagraphFont"/>
-    <w:link w:val="BodyText"/>
+  <w:style w:type="character" w:customStyle="1" w:styleId="TextkrperZchn">
+    <w:name w:val="Textkörper Zchn"/>
+    <w:basedOn w:val="Absatz-Standardschriftart"/>
+    <w:link w:val="Textkrper"/>
     <w:uiPriority w:val="1"/>
     <w:rsid w:val="003844DB"/>
     <w:rPr>
@@ -13219,7 +13139,7 @@
   </w:style>
   <w:style w:type="character" w:customStyle="1" w:styleId="ReferenceChar">
     <w:name w:val="Reference Char"/>
-    <w:basedOn w:val="BodyTextChar"/>
+    <w:basedOn w:val="TextkrperZchn"/>
     <w:link w:val="Reference"/>
     <w:rsid w:val="00FE425C"/>
     <w:rPr>
@@ -13227,10 +13147,10 @@
       <w:lang w:val="en-GB"/>
     </w:rPr>
   </w:style>
-  <w:style w:type="paragraph" w:styleId="FootnoteText">
+  <w:style w:type="paragraph" w:styleId="Funotentext">
     <w:name w:val="footnote text"/>
-    <w:basedOn w:val="Normal"/>
-    <w:link w:val="FootnoteTextChar"/>
+    <w:basedOn w:val="Standard"/>
+    <w:link w:val="FunotentextZchn"/>
     <w:uiPriority w:val="99"/>
     <w:semiHidden/>
     <w:unhideWhenUsed/>
@@ -13240,10 +13160,10 @@
       <w:szCs w:val="20"/>
     </w:rPr>
   </w:style>
-  <w:style w:type="character" w:customStyle="1" w:styleId="FootnoteTextChar">
-    <w:name w:val="Footnote Text Char"/>
-    <w:basedOn w:val="DefaultParagraphFont"/>
-    <w:link w:val="FootnoteText"/>
+  <w:style w:type="character" w:customStyle="1" w:styleId="FunotentextZchn">
+    <w:name w:val="Fußnotentext Zchn"/>
+    <w:basedOn w:val="Absatz-Standardschriftart"/>
+    <w:link w:val="Funotentext"/>
     <w:uiPriority w:val="99"/>
     <w:semiHidden/>
     <w:rsid w:val="007D50CE"/>
@@ -13253,9 +13173,9 @@
       <w:szCs w:val="20"/>
     </w:rPr>
   </w:style>
-  <w:style w:type="character" w:styleId="FootnoteReference">
+  <w:style w:type="character" w:styleId="Funotenzeichen">
     <w:name w:val="footnote reference"/>
-    <w:basedOn w:val="DefaultParagraphFont"/>
+    <w:basedOn w:val="Absatz-Standardschriftart"/>
     <w:uiPriority w:val="99"/>
     <w:semiHidden/>
     <w:unhideWhenUsed/>
@@ -13266,27 +13186,27 @@
   </w:style>
   <w:style w:type="character" w:customStyle="1" w:styleId="markrqfkst7q6">
     <w:name w:val="markrqfkst7q6"/>
-    <w:basedOn w:val="DefaultParagraphFont"/>
+    <w:basedOn w:val="Absatz-Standardschriftart"/>
     <w:rsid w:val="00E56818"/>
   </w:style>
   <w:style w:type="character" w:customStyle="1" w:styleId="markyfl5gne3f">
     <w:name w:val="markyfl5gne3f"/>
-    <w:basedOn w:val="DefaultParagraphFont"/>
+    <w:basedOn w:val="Absatz-Standardschriftart"/>
     <w:rsid w:val="00FE3EDD"/>
   </w:style>
   <w:style w:type="character" w:customStyle="1" w:styleId="mark7ixbv9rgs">
     <w:name w:val="mark7ixbv9rgs"/>
-    <w:basedOn w:val="DefaultParagraphFont"/>
+    <w:basedOn w:val="Absatz-Standardschriftart"/>
     <w:rsid w:val="00FE3EDD"/>
   </w:style>
   <w:style w:type="character" w:customStyle="1" w:styleId="mark29nnys12j">
     <w:name w:val="mark29nnys12j"/>
-    <w:basedOn w:val="DefaultParagraphFont"/>
+    <w:basedOn w:val="Absatz-Standardschriftart"/>
     <w:rsid w:val="00B4456D"/>
   </w:style>
-  <w:style w:type="paragraph" w:styleId="NormalWeb">
+  <w:style w:type="paragraph" w:styleId="StandardWeb">
     <w:name w:val="Normal (Web)"/>
-    <w:basedOn w:val="Normal"/>
+    <w:basedOn w:val="Standard"/>
     <w:uiPriority w:val="99"/>
     <w:unhideWhenUsed/>
     <w:rsid w:val="00817F69"/>
@@ -13303,9 +13223,9 @@
       <w:lang w:val="en-GB" w:eastAsia="en-GB"/>
     </w:rPr>
   </w:style>
-  <w:style w:type="character" w:styleId="Emphasis">
+  <w:style w:type="character" w:styleId="Hervorhebung">
     <w:name w:val="Emphasis"/>
-    <w:basedOn w:val="DefaultParagraphFont"/>
+    <w:basedOn w:val="Absatz-Standardschriftart"/>
     <w:uiPriority w:val="20"/>
     <w:qFormat/>
     <w:rsid w:val="006D1885"/>
@@ -13314,9 +13234,9 @@
       <w:iCs/>
     </w:rPr>
   </w:style>
-  <w:style w:type="character" w:styleId="FollowedHyperlink">
+  <w:style w:type="character" w:styleId="BesuchterLink">
     <w:name w:val="FollowedHyperlink"/>
-    <w:basedOn w:val="DefaultParagraphFont"/>
+    <w:basedOn w:val="Absatz-Standardschriftart"/>
     <w:uiPriority w:val="99"/>
     <w:semiHidden/>
     <w:unhideWhenUsed/>
@@ -13326,7 +13246,7 @@
       <w:u w:val="single"/>
     </w:rPr>
   </w:style>
-  <w:style w:type="paragraph" w:styleId="Revision">
+  <w:style w:type="paragraph" w:styleId="berarbeitung">
     <w:name w:val="Revision"/>
     <w:hidden/>
     <w:uiPriority w:val="99"/>
@@ -13341,9 +13261,9 @@
       <w:rFonts w:ascii="Arial" w:eastAsia="Arial" w:hAnsi="Arial" w:cs="Arial"/>
     </w:rPr>
   </w:style>
-  <w:style w:type="character" w:styleId="CommentReference">
+  <w:style w:type="character" w:styleId="Kommentarzeichen">
     <w:name w:val="annotation reference"/>
-    <w:basedOn w:val="DefaultParagraphFont"/>
+    <w:basedOn w:val="Absatz-Standardschriftart"/>
     <w:uiPriority w:val="99"/>
     <w:semiHidden/>
     <w:unhideWhenUsed/>
@@ -13353,10 +13273,10 @@
       <w:szCs w:val="16"/>
     </w:rPr>
   </w:style>
-  <w:style w:type="paragraph" w:styleId="CommentText">
+  <w:style w:type="paragraph" w:styleId="Kommentartext">
     <w:name w:val="annotation text"/>
-    <w:basedOn w:val="Normal"/>
-    <w:link w:val="CommentTextChar"/>
+    <w:basedOn w:val="Standard"/>
+    <w:link w:val="KommentartextZchn"/>
     <w:uiPriority w:val="99"/>
     <w:unhideWhenUsed/>
     <w:rsid w:val="00AE7876"/>
@@ -13365,10 +13285,10 @@
       <w:szCs w:val="20"/>
     </w:rPr>
   </w:style>
-  <w:style w:type="character" w:customStyle="1" w:styleId="CommentTextChar">
-    <w:name w:val="Comment Text Char"/>
-    <w:basedOn w:val="DefaultParagraphFont"/>
-    <w:link w:val="CommentText"/>
+  <w:style w:type="character" w:customStyle="1" w:styleId="KommentartextZchn">
+    <w:name w:val="Kommentartext Zchn"/>
+    <w:basedOn w:val="Absatz-Standardschriftart"/>
+    <w:link w:val="Kommentartext"/>
     <w:uiPriority w:val="99"/>
     <w:rsid w:val="00AE7876"/>
     <w:rPr>
@@ -13377,11 +13297,11 @@
       <w:szCs w:val="20"/>
     </w:rPr>
   </w:style>
-  <w:style w:type="paragraph" w:styleId="CommentSubject">
+  <w:style w:type="paragraph" w:styleId="Kommentarthema">
     <w:name w:val="annotation subject"/>
-    <w:basedOn w:val="CommentText"/>
-    <w:next w:val="CommentText"/>
-    <w:link w:val="CommentSubjectChar"/>
+    <w:basedOn w:val="Kommentartext"/>
+    <w:next w:val="Kommentartext"/>
+    <w:link w:val="KommentarthemaZchn"/>
     <w:uiPriority w:val="99"/>
     <w:semiHidden/>
     <w:unhideWhenUsed/>
@@ -13391,10 +13311,10 @@
       <w:bCs/>
     </w:rPr>
   </w:style>
-  <w:style w:type="character" w:customStyle="1" w:styleId="CommentSubjectChar">
-    <w:name w:val="Comment Subject Char"/>
-    <w:basedOn w:val="CommentTextChar"/>
-    <w:link w:val="CommentSubject"/>
+  <w:style w:type="character" w:customStyle="1" w:styleId="KommentarthemaZchn">
+    <w:name w:val="Kommentarthema Zchn"/>
+    <w:basedOn w:val="KommentartextZchn"/>
+    <w:link w:val="Kommentarthema"/>
     <w:uiPriority w:val="99"/>
     <w:semiHidden/>
     <w:rsid w:val="00AE7876"/>
@@ -13408,7 +13328,7 @@
   </w:style>
   <w:style w:type="paragraph" w:customStyle="1" w:styleId="XML">
     <w:name w:val="XML"/>
-    <w:basedOn w:val="BodyText"/>
+    <w:basedOn w:val="Textkrper"/>
     <w:qFormat/>
     <w:rsid w:val="00970A89"/>
     <w:rPr>
@@ -13445,7 +13365,7 @@
           </w:pPr>
           <w:r>
             <w:rPr>
-              <w:rStyle w:val="PlaceholderText"/>
+              <w:rStyle w:val="Platzhaltertext"/>
             </w:rPr>
             <w:t>[Subject]</w:t>
           </w:r>
@@ -13474,7 +13394,7 @@
           </w:pPr>
           <w:r>
             <w:rPr>
-              <w:rStyle w:val="PlaceholderText"/>
+              <w:rStyle w:val="Platzhaltertext"/>
             </w:rPr>
             <w:t>[Company]</w:t>
           </w:r>
@@ -13503,7 +13423,7 @@
           </w:pPr>
           <w:r>
             <w:rPr>
-              <w:rStyle w:val="PlaceholderText"/>
+              <w:rStyle w:val="Platzhaltertext"/>
             </w:rPr>
             <w:t>[Title]</w:t>
           </w:r>
@@ -13532,7 +13452,7 @@
           </w:pPr>
           <w:r>
             <w:rPr>
-              <w:rStyle w:val="PlaceholderText"/>
+              <w:rStyle w:val="Platzhaltertext"/>
             </w:rPr>
             <w:t>[Subject]</w:t>
           </w:r>
@@ -13585,7 +13505,7 @@
     <w:charset w:val="00"/>
     <w:family w:val="swiss"/>
     <w:pitch w:val="variable"/>
-    <w:sig w:usb0="E4002EFF" w:usb1="C200247B" w:usb2="00000009" w:usb3="00000000" w:csb0="000001FF" w:csb1="00000000"/>
+    <w:sig w:usb0="E4002EFF" w:usb1="C000247B" w:usb2="00000009" w:usb3="00000000" w:csb0="000001FF" w:csb1="00000000"/>
   </w:font>
   <w:font w:name="Cambria">
     <w:panose1 w:val="02040503050406030204"/>
@@ -13654,6 +13574,7 @@
     <w:rsid w:val="00916D7B"/>
     <w:rsid w:val="009C3F03"/>
     <w:rsid w:val="009F352A"/>
+    <w:rsid w:val="00A55012"/>
     <w:rsid w:val="00A55B8E"/>
     <w:rsid w:val="00A6000F"/>
     <w:rsid w:val="00AC349B"/>
@@ -13682,8 +13603,8 @@
   </m:mathPr>
   <w:themeFontLang w:val="en-GB"/>
   <w:clrSchemeMapping w:bg1="light1" w:t1="dark1" w:bg2="light2" w:t2="dark2" w:accent1="accent1" w:accent2="accent2" w:accent3="accent3" w:accent4="accent4" w:accent5="accent5" w:accent6="accent6" w:hyperlink="hyperlink" w:followedHyperlink="followedHyperlink"/>
-  <w:decimalSymbol w:val="."/>
-  <w:listSeparator w:val=","/>
+  <w:decimalSymbol w:val=","/>
+  <w:listSeparator w:val=";"/>
   <w15:chartTrackingRefBased/>
 </w:settings>
 </file>
@@ -14085,17 +14006,17 @@
     <w:lsdException w:name="Unresolved Mention" w:semiHidden="1" w:unhideWhenUsed="1"/>
     <w:lsdException w:name="Smart Link" w:semiHidden="1" w:unhideWhenUsed="1"/>
   </w:latentStyles>
-  <w:style w:type="paragraph" w:default="1" w:styleId="Normal">
+  <w:style w:type="paragraph" w:default="1" w:styleId="Standard">
     <w:name w:val="Normal"/>
     <w:qFormat/>
   </w:style>
-  <w:style w:type="character" w:default="1" w:styleId="DefaultParagraphFont">
+  <w:style w:type="character" w:default="1" w:styleId="Absatz-Standardschriftart">
     <w:name w:val="Default Paragraph Font"/>
     <w:uiPriority w:val="1"/>
     <w:semiHidden/>
     <w:unhideWhenUsed/>
   </w:style>
-  <w:style w:type="table" w:default="1" w:styleId="TableNormal">
+  <w:style w:type="table" w:default="1" w:styleId="NormaleTabelle">
     <w:name w:val="Normal Table"/>
     <w:uiPriority w:val="99"/>
     <w:semiHidden/>
@@ -14110,15 +14031,15 @@
       </w:tblCellMar>
     </w:tblPr>
   </w:style>
-  <w:style w:type="numbering" w:default="1" w:styleId="NoList">
+  <w:style w:type="numbering" w:default="1" w:styleId="KeineListe">
     <w:name w:val="No List"/>
     <w:uiPriority w:val="99"/>
     <w:semiHidden/>
     <w:unhideWhenUsed/>
   </w:style>
-  <w:style w:type="character" w:styleId="PlaceholderText">
+  <w:style w:type="character" w:styleId="Platzhaltertext">
     <w:name w:val="Placeholder Text"/>
-    <w:basedOn w:val="DefaultParagraphFont"/>
+    <w:basedOn w:val="Absatz-Standardschriftart"/>
     <w:uiPriority w:val="99"/>
     <w:semiHidden/>
     <w:rsid w:val="00293491"/>
@@ -14436,6 +14357,18 @@
 </file>
 
 <file path=customXml/item1.xml><?xml version="1.0" encoding="utf-8"?>
+<b:Sources xmlns:b="http://schemas.openxmlformats.org/officeDocument/2006/bibliography" xmlns="http://schemas.openxmlformats.org/officeDocument/2006/bibliography" SelectedStyle="\APASixthEditionOfficeOnline.xsl" StyleName="APA" Version="6"/>
+</file>
+
+<file path=customXml/item2.xml><?xml version="1.0" encoding="utf-8"?>
+<p:properties xmlns:p="http://schemas.microsoft.com/office/2006/metadata/properties" xmlns:xsi="http://www.w3.org/2001/XMLSchema-instance" xmlns:pc="http://schemas.microsoft.com/office/infopath/2007/PartnerControls">
+  <documentManagement>
+    <_activity xmlns="7e98115e-32c4-49b4-8c47-8e0291a4fa04" xsi:nil="true"/>
+  </documentManagement>
+</p:properties>
+</file>
+
+<file path=customXml/item3.xml><?xml version="1.0" encoding="utf-8"?>
 <ct:contentTypeSchema xmlns:ct="http://schemas.microsoft.com/office/2006/metadata/contentType" xmlns:ma="http://schemas.microsoft.com/office/2006/metadata/properties/metaAttributes" ct:_="" ma:_="" ma:contentTypeName="Dokument" ma:contentTypeID="0x010100776041F8CE30E747B6CA994F30662BE8" ma:contentTypeVersion="18" ma:contentTypeDescription="Opprett et nytt dokument." ma:contentTypeScope="" ma:versionID="deb1daf185705a241c2caf02fd179627">
   <xsd:schema xmlns:xsd="http://www.w3.org/2001/XMLSchema" xmlns:xs="http://www.w3.org/2001/XMLSchema" xmlns:p="http://schemas.microsoft.com/office/2006/metadata/properties" xmlns:ns3="adbd838b-2ea2-4cb9-9bb2-a01efdf59564" xmlns:ns4="7e98115e-32c4-49b4-8c47-8e0291a4fa04" targetNamespace="http://schemas.microsoft.com/office/2006/metadata/properties" ma:root="true" ma:fieldsID="89945e090dede48e2e383ab088b641cd" ns3:_="" ns4:_="">
     <xsd:import namespace="adbd838b-2ea2-4cb9-9bb2-a01efdf59564"/>
@@ -14688,18 +14621,6 @@
 </ct:contentTypeSchema>
 </file>
 
-<file path=customXml/item2.xml><?xml version="1.0" encoding="utf-8"?>
-<p:properties xmlns:p="http://schemas.microsoft.com/office/2006/metadata/properties" xmlns:xsi="http://www.w3.org/2001/XMLSchema-instance" xmlns:pc="http://schemas.microsoft.com/office/infopath/2007/PartnerControls">
-  <documentManagement>
-    <_activity xmlns="7e98115e-32c4-49b4-8c47-8e0291a4fa04" xsi:nil="true"/>
-  </documentManagement>
-</p:properties>
-</file>
-
-<file path=customXml/item3.xml><?xml version="1.0" encoding="utf-8"?>
-<b:Sources xmlns:b="http://schemas.openxmlformats.org/officeDocument/2006/bibliography" xmlns="http://schemas.openxmlformats.org/officeDocument/2006/bibliography" SelectedStyle="\APASixthEditionOfficeOnline.xsl" StyleName="APA" Version="6"/>
-</file>
-
 <file path=customXml/item4.xml><?xml version="1.0" encoding="utf-8"?>
 <?mso-contentType ?>
 <FormTemplates xmlns="http://schemas.microsoft.com/sharepoint/v3/contenttype/forms">
@@ -14710,6 +14631,24 @@
 </file>
 
 <file path=customXml/itemProps1.xml><?xml version="1.0" encoding="utf-8"?>
+<ds:datastoreItem xmlns:ds="http://schemas.openxmlformats.org/officeDocument/2006/customXml" ds:itemID="{23508F25-1CFF-4E55-9938-48AFE50A8977}">
+  <ds:schemaRefs>
+    <ds:schemaRef ds:uri="http://schemas.openxmlformats.org/officeDocument/2006/bibliography"/>
+  </ds:schemaRefs>
+</ds:datastoreItem>
+</file>
+
+<file path=customXml/itemProps2.xml><?xml version="1.0" encoding="utf-8"?>
+<ds:datastoreItem xmlns:ds="http://schemas.openxmlformats.org/officeDocument/2006/customXml" ds:itemID="{DAA0423C-7B97-4E5A-848E-C2FAD5B5B7B0}">
+  <ds:schemaRefs>
+    <ds:schemaRef ds:uri="http://schemas.microsoft.com/office/2006/metadata/properties"/>
+    <ds:schemaRef ds:uri="http://schemas.microsoft.com/office/infopath/2007/PartnerControls"/>
+    <ds:schemaRef ds:uri="7e98115e-32c4-49b4-8c47-8e0291a4fa04"/>
+  </ds:schemaRefs>
+</ds:datastoreItem>
+</file>
+
+<file path=customXml/itemProps3.xml><?xml version="1.0" encoding="utf-8"?>
 <ds:datastoreItem xmlns:ds="http://schemas.openxmlformats.org/officeDocument/2006/customXml" ds:itemID="{1544F244-AEB7-488E-8A0B-2F69E695C909}">
   <ds:schemaRefs>
     <ds:schemaRef ds:uri="http://schemas.microsoft.com/office/2006/metadata/contentType"/>
@@ -14728,24 +14667,6 @@
 </ds:datastoreItem>
 </file>
 
-<file path=customXml/itemProps2.xml><?xml version="1.0" encoding="utf-8"?>
-<ds:datastoreItem xmlns:ds="http://schemas.openxmlformats.org/officeDocument/2006/customXml" ds:itemID="{DAA0423C-7B97-4E5A-848E-C2FAD5B5B7B0}">
-  <ds:schemaRefs>
-    <ds:schemaRef ds:uri="http://schemas.microsoft.com/office/2006/metadata/properties"/>
-    <ds:schemaRef ds:uri="http://schemas.microsoft.com/office/infopath/2007/PartnerControls"/>
-    <ds:schemaRef ds:uri="7e98115e-32c4-49b4-8c47-8e0291a4fa04"/>
-  </ds:schemaRefs>
-</ds:datastoreItem>
-</file>
-
-<file path=customXml/itemProps3.xml><?xml version="1.0" encoding="utf-8"?>
-<ds:datastoreItem xmlns:ds="http://schemas.openxmlformats.org/officeDocument/2006/customXml" ds:itemID="{23508F25-1CFF-4E55-9938-48AFE50A8977}">
-  <ds:schemaRefs>
-    <ds:schemaRef ds:uri="http://schemas.openxmlformats.org/officeDocument/2006/bibliography"/>
-  </ds:schemaRefs>
-</ds:datastoreItem>
-</file>
-
 <file path=customXml/itemProps4.xml><?xml version="1.0" encoding="utf-8"?>
 <ds:datastoreItem xmlns:ds="http://schemas.openxmlformats.org/officeDocument/2006/customXml" ds:itemID="{8A44BDE6-684E-4B5B-881D-4E5D5848FCED}">
   <ds:schemaRefs>

</xml_diff>

<commit_message>
fixes for gap analysis
</commit_message>
<xml_diff>
--- a/ContinuationProject/DISC_DEXPI_GapAnalysis.docx
+++ b/ContinuationProject/DISC_DEXPI_GapAnalysis.docx
@@ -2549,9 +2549,9 @@
         </w:sectPr>
       </w:pPr>
     </w:p>
-    <w:bookmarkStart w:id="0" w:name="_bookmark1" w:displacedByCustomXml="next"/>
+    <w:bookmarkStart w:id="0" w:name="_bookmark0" w:displacedByCustomXml="next"/>
     <w:bookmarkEnd w:id="0" w:displacedByCustomXml="next"/>
-    <w:bookmarkStart w:id="1" w:name="_bookmark0" w:displacedByCustomXml="next"/>
+    <w:bookmarkStart w:id="1" w:name="_bookmark1" w:displacedByCustomXml="next"/>
     <w:bookmarkEnd w:id="1" w:displacedByCustomXml="next"/>
     <w:sdt>
       <w:sdtPr>
@@ -7867,10 +7867,7 @@
       </w:pPr>
       <w:ins w:id="27" w:author="Manfred Theißen" w:date="2025-08-18T17:39:00Z" w16du:dateUtc="2025-08-18T15:39:00Z">
         <w:r>
-          <w:t>N</w:t>
-        </w:r>
-        <w:r>
-          <w:t>ew blueprint files have to be created that cover some of the new requirements (cf. gaps in domain modeling above).</w:t>
+          <w:t>New blueprint files have to be created that cover some of the new requirements (cf. gaps in domain modeling above).</w:t>
         </w:r>
       </w:ins>
     </w:p>
@@ -7960,40 +7957,70 @@
       </w:pPr>
       <w:ins w:id="41" w:author="Manfred Theißen" w:date="2025-08-18T17:50:00Z" w16du:dateUtc="2025-08-18T15:50:00Z">
         <w:r>
-          <w:t xml:space="preserve">correctmess and </w:t>
+          <w:t>correct</w:t>
         </w:r>
       </w:ins>
-      <w:ins w:id="42" w:author="Manfred Theißen" w:date="2025-08-18T17:48:00Z" w16du:dateUtc="2025-08-18T15:48:00Z">
+      <w:ins w:id="42" w:author="Manfred Theißen" w:date="2025-08-18T18:12:00Z" w16du:dateUtc="2025-08-18T16:12:00Z">
+        <w:r>
+          <w:t>n</w:t>
+        </w:r>
+      </w:ins>
+      <w:ins w:id="43" w:author="Manfred Theißen" w:date="2025-08-18T17:50:00Z" w16du:dateUtc="2025-08-18T15:50:00Z">
+        <w:r>
+          <w:t xml:space="preserve">ess and </w:t>
+        </w:r>
+      </w:ins>
+      <w:ins w:id="44" w:author="Manfred Theißen" w:date="2025-08-18T17:48:00Z" w16du:dateUtc="2025-08-18T15:48:00Z">
         <w:r>
           <w:t>completeness</w:t>
         </w:r>
       </w:ins>
-      <w:ins w:id="43" w:author="Manfred Theißen" w:date="2025-08-18T17:49:00Z" w16du:dateUtc="2025-08-18T15:49:00Z">
+      <w:ins w:id="45" w:author="Manfred Theißen" w:date="2025-08-18T17:49:00Z" w16du:dateUtc="2025-08-18T15:49:00Z">
         <w:r>
           <w:t xml:space="preserve"> </w:t>
         </w:r>
       </w:ins>
-      <w:ins w:id="44" w:author="Manfred Theißen" w:date="2025-08-18T17:50:00Z" w16du:dateUtc="2025-08-18T15:50:00Z">
+      <w:ins w:id="46" w:author="Manfred Theißen" w:date="2025-08-18T17:50:00Z" w16du:dateUtc="2025-08-18T15:50:00Z">
         <w:r>
           <w:t>in terms of content (</w:t>
         </w:r>
       </w:ins>
-      <w:ins w:id="45" w:author="Manfred Theißen" w:date="2025-08-18T17:49:00Z" w16du:dateUtc="2025-08-18T15:49:00Z">
+      <w:ins w:id="47" w:author="Manfred Theißen" w:date="2025-08-18T17:49:00Z" w16du:dateUtc="2025-08-18T15:49:00Z">
         <w:r>
           <w:t>e.g.,</w:t>
         </w:r>
       </w:ins>
-      <w:ins w:id="46" w:author="Manfred Theißen" w:date="2025-08-18T17:51:00Z" w16du:dateUtc="2025-08-18T15:51:00Z">
+      <w:ins w:id="48" w:author="Manfred Theißen" w:date="2025-08-18T17:51:00Z" w16du:dateUtc="2025-08-18T15:51:00Z">
         <w:r>
-          <w:t xml:space="preserve"> while repredocing a blueprint file, the conceptual information (objects and attributes) should be both correct and</w:t>
+          <w:t xml:space="preserve"> while repr</w:t>
         </w:r>
       </w:ins>
-      <w:ins w:id="47" w:author="Manfred Theißen" w:date="2025-08-18T17:52:00Z" w16du:dateUtc="2025-08-18T15:52:00Z">
+      <w:ins w:id="49" w:author="Manfred Theißen" w:date="2025-08-18T18:12:00Z" w16du:dateUtc="2025-08-18T16:12:00Z">
+        <w:r>
+          <w:t>o</w:t>
+        </w:r>
+      </w:ins>
+      <w:ins w:id="50" w:author="Manfred Theißen" w:date="2025-08-18T17:51:00Z" w16du:dateUtc="2025-08-18T15:51:00Z">
+        <w:r>
+          <w:t>d</w:t>
+        </w:r>
+      </w:ins>
+      <w:ins w:id="51" w:author="Manfred Theißen" w:date="2025-08-18T18:12:00Z" w16du:dateUtc="2025-08-18T16:12:00Z">
+        <w:r>
+          <w:t>u</w:t>
+        </w:r>
+      </w:ins>
+      <w:ins w:id="52" w:author="Manfred Theißen" w:date="2025-08-18T17:51:00Z" w16du:dateUtc="2025-08-18T15:51:00Z">
+        <w:r>
+          <w:t>cing a blueprint file, the conceptual information (objects and attributes) should be both correct and</w:t>
+        </w:r>
+      </w:ins>
+      <w:ins w:id="53" w:author="Manfred Theißen" w:date="2025-08-18T17:52:00Z" w16du:dateUtc="2025-08-18T15:52:00Z">
         <w:r>
           <w:t xml:space="preserve"> complete in a strict sense; for the graphics, certain deviations are admissible provided an engineer per</w:t>
         </w:r>
       </w:ins>
-      <w:ins w:id="48" w:author="Manfred Theißen" w:date="2025-08-18T17:53:00Z" w16du:dateUtc="2025-08-18T15:53:00Z">
+      <w:ins w:id="54" w:author="Manfred Theißen" w:date="2025-08-18T17:53:00Z" w16du:dateUtc="2025-08-18T15:53:00Z">
         <w:r>
           <w:t>ceives the diagram as equivalent to the original blueprint’s graphics).</w:t>
         </w:r>
@@ -8003,10 +8030,10 @@
       <w:pPr>
         <w:pStyle w:val="Textkrper"/>
         <w:rPr>
-          <w:ins w:id="49" w:author="Manfred Theißen" w:date="2025-08-18T17:54:00Z" w16du:dateUtc="2025-08-18T15:54:00Z"/>
+          <w:ins w:id="55" w:author="Manfred Theißen" w:date="2025-08-18T17:54:00Z" w16du:dateUtc="2025-08-18T15:54:00Z"/>
         </w:rPr>
       </w:pPr>
-      <w:ins w:id="50" w:author="Manfred Theißen" w:date="2025-08-18T17:54:00Z" w16du:dateUtc="2025-08-18T15:54:00Z">
+      <w:ins w:id="56" w:author="Manfred Theißen" w:date="2025-08-18T17:54:00Z" w16du:dateUtc="2025-08-18T15:54:00Z">
         <w:r>
           <w:t>Gap:</w:t>
         </w:r>
@@ -8020,10 +8047,10 @@
           <w:numId w:val="20"/>
         </w:numPr>
         <w:rPr>
-          <w:ins w:id="51" w:author="Manfred Theißen" w:date="2025-08-18T17:55:00Z" w16du:dateUtc="2025-08-18T15:55:00Z"/>
+          <w:ins w:id="57" w:author="Manfred Theißen" w:date="2025-08-18T17:55:00Z" w16du:dateUtc="2025-08-18T15:55:00Z"/>
         </w:rPr>
       </w:pPr>
-      <w:ins w:id="52" w:author="Manfred Theißen" w:date="2025-08-18T17:54:00Z" w16du:dateUtc="2025-08-18T15:54:00Z">
+      <w:ins w:id="58" w:author="Manfred Theißen" w:date="2025-08-18T17:54:00Z" w16du:dateUtc="2025-08-18T15:54:00Z">
         <w:r>
           <w:t>scoring system</w:t>
         </w:r>
@@ -8037,10 +8064,10 @@
           <w:numId w:val="20"/>
         </w:numPr>
         <w:rPr>
-          <w:ins w:id="53" w:author="Manfred Theißen" w:date="2025-08-18T17:54:00Z" w16du:dateUtc="2025-08-18T15:54:00Z"/>
+          <w:ins w:id="59" w:author="Manfred Theißen" w:date="2025-08-18T17:54:00Z" w16du:dateUtc="2025-08-18T15:54:00Z"/>
         </w:rPr>
       </w:pPr>
-      <w:ins w:id="54" w:author="Manfred Theißen" w:date="2025-08-18T17:55:00Z" w16du:dateUtc="2025-08-18T15:55:00Z">
+      <w:ins w:id="60" w:author="Manfred Theißen" w:date="2025-08-18T17:55:00Z" w16du:dateUtc="2025-08-18T15:55:00Z">
         <w:r>
           <w:t>weighting</w:t>
         </w:r>
@@ -8050,7 +8077,7 @@
       <w:pPr>
         <w:pStyle w:val="Textkrper"/>
         <w:rPr>
-          <w:ins w:id="55" w:author="Manfred Theißen" w:date="2025-08-18T17:54:00Z" w16du:dateUtc="2025-08-18T15:54:00Z"/>
+          <w:ins w:id="61" w:author="Manfred Theißen" w:date="2025-08-18T17:54:00Z" w16du:dateUtc="2025-08-18T15:54:00Z"/>
         </w:rPr>
       </w:pPr>
     </w:p>
@@ -8058,9 +8085,9 @@
       <w:pPr>
         <w:pStyle w:val="Textkrper"/>
         <w:rPr>
-          <w:ins w:id="56" w:author="Manfred Theißen" w:date="2025-08-18T17:48:00Z" w16du:dateUtc="2025-08-18T15:48:00Z"/>
+          <w:ins w:id="62" w:author="Manfred Theißen" w:date="2025-08-18T17:48:00Z" w16du:dateUtc="2025-08-18T15:48:00Z"/>
         </w:rPr>
-        <w:pPrChange w:id="57" w:author="Manfred Theißen" w:date="2025-08-18T17:54:00Z" w16du:dateUtc="2025-08-18T15:54:00Z">
+        <w:pPrChange w:id="63" w:author="Manfred Theißen" w:date="2025-08-18T17:54:00Z" w16du:dateUtc="2025-08-18T15:54:00Z">
           <w:pPr>
             <w:pStyle w:val="Textkrper"/>
             <w:numPr>
@@ -8075,9 +8102,9 @@
       <w:pPr>
         <w:pStyle w:val="Textkrper"/>
         <w:rPr>
-          <w:ins w:id="58" w:author="Manfred Theißen" w:date="2025-08-18T17:48:00Z" w16du:dateUtc="2025-08-18T15:48:00Z"/>
+          <w:ins w:id="64" w:author="Manfred Theißen" w:date="2025-08-18T17:48:00Z" w16du:dateUtc="2025-08-18T15:48:00Z"/>
         </w:rPr>
-        <w:pPrChange w:id="59" w:author="Manfred Theißen" w:date="2025-08-18T17:48:00Z" w16du:dateUtc="2025-08-18T15:48:00Z">
+        <w:pPrChange w:id="65" w:author="Manfred Theißen" w:date="2025-08-18T17:48:00Z" w16du:dateUtc="2025-08-18T15:48:00Z">
           <w:pPr>
             <w:pStyle w:val="Textkrper"/>
             <w:numPr>
@@ -8093,9 +8120,9 @@
         <w:pStyle w:val="Textkrper"/>
         <w:ind w:left="621"/>
         <w:rPr>
-          <w:ins w:id="60" w:author="Manfred Theißen" w:date="2025-08-18T17:47:00Z" w16du:dateUtc="2025-08-18T15:47:00Z"/>
+          <w:ins w:id="66" w:author="Manfred Theißen" w:date="2025-08-18T17:47:00Z" w16du:dateUtc="2025-08-18T15:47:00Z"/>
         </w:rPr>
-        <w:pPrChange w:id="61" w:author="Manfred Theißen" w:date="2025-08-18T17:48:00Z" w16du:dateUtc="2025-08-18T15:48:00Z">
+        <w:pPrChange w:id="67" w:author="Manfred Theißen" w:date="2025-08-18T17:48:00Z" w16du:dateUtc="2025-08-18T15:48:00Z">
           <w:pPr>
             <w:pStyle w:val="Textkrper"/>
           </w:pPr>
@@ -8106,9 +8133,9 @@
       <w:pPr>
         <w:pStyle w:val="Textkrper"/>
         <w:rPr>
-          <w:ins w:id="62" w:author="Manfred Theißen" w:date="2025-08-18T17:39:00Z" w16du:dateUtc="2025-08-18T15:39:00Z"/>
+          <w:ins w:id="68" w:author="Manfred Theißen" w:date="2025-08-18T17:39:00Z" w16du:dateUtc="2025-08-18T15:39:00Z"/>
         </w:rPr>
-        <w:pPrChange w:id="63" w:author="Manfred Theißen" w:date="2025-08-18T17:46:00Z" w16du:dateUtc="2025-08-18T15:46:00Z">
+        <w:pPrChange w:id="69" w:author="Manfred Theißen" w:date="2025-08-18T17:46:00Z" w16du:dateUtc="2025-08-18T15:46:00Z">
           <w:pPr>
             <w:pStyle w:val="Textkrper"/>
             <w:numPr>
@@ -8143,12 +8170,12 @@
       <w:pPr>
         <w:pStyle w:val="berschrift1"/>
       </w:pPr>
-      <w:bookmarkStart w:id="64" w:name="_Toc206410183"/>
+      <w:bookmarkStart w:id="70" w:name="_Toc206410183"/>
       <w:r>
         <w:lastRenderedPageBreak/>
         <w:t>Out-of-Scope Gaps</w:t>
       </w:r>
-      <w:bookmarkEnd w:id="64"/>
+      <w:bookmarkEnd w:id="70"/>
     </w:p>
     <w:p>
       <w:pPr>
@@ -13566,6 +13593,7 @@
     <w:rsid w:val="00433841"/>
     <w:rsid w:val="005255C2"/>
     <w:rsid w:val="005465E1"/>
+    <w:rsid w:val="005614F8"/>
     <w:rsid w:val="005A4329"/>
     <w:rsid w:val="00652177"/>
     <w:rsid w:val="006C273C"/>
@@ -14357,10 +14385,6 @@
 </file>
 
 <file path=customXml/item1.xml><?xml version="1.0" encoding="utf-8"?>
-<b:Sources xmlns:b="http://schemas.openxmlformats.org/officeDocument/2006/bibliography" xmlns="http://schemas.openxmlformats.org/officeDocument/2006/bibliography" SelectedStyle="\APASixthEditionOfficeOnline.xsl" StyleName="APA" Version="6"/>
-</file>
-
-<file path=customXml/item2.xml><?xml version="1.0" encoding="utf-8"?>
 <p:properties xmlns:p="http://schemas.microsoft.com/office/2006/metadata/properties" xmlns:xsi="http://www.w3.org/2001/XMLSchema-instance" xmlns:pc="http://schemas.microsoft.com/office/infopath/2007/PartnerControls">
   <documentManagement>
     <_activity xmlns="7e98115e-32c4-49b4-8c47-8e0291a4fa04" xsi:nil="true"/>
@@ -14368,7 +14392,20 @@
 </p:properties>
 </file>
 
+<file path=customXml/item2.xml><?xml version="1.0" encoding="utf-8"?>
+<b:Sources xmlns:b="http://schemas.openxmlformats.org/officeDocument/2006/bibliography" xmlns="http://schemas.openxmlformats.org/officeDocument/2006/bibliography" SelectedStyle="\APASixthEditionOfficeOnline.xsl" StyleName="APA" Version="6"/>
+</file>
+
 <file path=customXml/item3.xml><?xml version="1.0" encoding="utf-8"?>
+<?mso-contentType ?>
+<FormTemplates xmlns="http://schemas.microsoft.com/sharepoint/v3/contenttype/forms">
+  <Display>DocumentLibraryForm</Display>
+  <Edit>DocumentLibraryForm</Edit>
+  <New>DocumentLibraryForm</New>
+</FormTemplates>
+</file>
+
+<file path=customXml/item4.xml><?xml version="1.0" encoding="utf-8"?>
 <ct:contentTypeSchema xmlns:ct="http://schemas.microsoft.com/office/2006/metadata/contentType" xmlns:ma="http://schemas.microsoft.com/office/2006/metadata/properties/metaAttributes" ct:_="" ma:_="" ma:contentTypeName="Dokument" ma:contentTypeID="0x010100776041F8CE30E747B6CA994F30662BE8" ma:contentTypeVersion="18" ma:contentTypeDescription="Opprett et nytt dokument." ma:contentTypeScope="" ma:versionID="deb1daf185705a241c2caf02fd179627">
   <xsd:schema xmlns:xsd="http://www.w3.org/2001/XMLSchema" xmlns:xs="http://www.w3.org/2001/XMLSchema" xmlns:p="http://schemas.microsoft.com/office/2006/metadata/properties" xmlns:ns3="adbd838b-2ea2-4cb9-9bb2-a01efdf59564" xmlns:ns4="7e98115e-32c4-49b4-8c47-8e0291a4fa04" targetNamespace="http://schemas.microsoft.com/office/2006/metadata/properties" ma:root="true" ma:fieldsID="89945e090dede48e2e383ab088b641cd" ns3:_="" ns4:_="">
     <xsd:import namespace="adbd838b-2ea2-4cb9-9bb2-a01efdf59564"/>
@@ -14621,24 +14658,7 @@
 </ct:contentTypeSchema>
 </file>
 
-<file path=customXml/item4.xml><?xml version="1.0" encoding="utf-8"?>
-<?mso-contentType ?>
-<FormTemplates xmlns="http://schemas.microsoft.com/sharepoint/v3/contenttype/forms">
-  <Display>DocumentLibraryForm</Display>
-  <Edit>DocumentLibraryForm</Edit>
-  <New>DocumentLibraryForm</New>
-</FormTemplates>
-</file>
-
 <file path=customXml/itemProps1.xml><?xml version="1.0" encoding="utf-8"?>
-<ds:datastoreItem xmlns:ds="http://schemas.openxmlformats.org/officeDocument/2006/customXml" ds:itemID="{23508F25-1CFF-4E55-9938-48AFE50A8977}">
-  <ds:schemaRefs>
-    <ds:schemaRef ds:uri="http://schemas.openxmlformats.org/officeDocument/2006/bibliography"/>
-  </ds:schemaRefs>
-</ds:datastoreItem>
-</file>
-
-<file path=customXml/itemProps2.xml><?xml version="1.0" encoding="utf-8"?>
 <ds:datastoreItem xmlns:ds="http://schemas.openxmlformats.org/officeDocument/2006/customXml" ds:itemID="{DAA0423C-7B97-4E5A-848E-C2FAD5B5B7B0}">
   <ds:schemaRefs>
     <ds:schemaRef ds:uri="http://schemas.microsoft.com/office/2006/metadata/properties"/>
@@ -14648,7 +14668,23 @@
 </ds:datastoreItem>
 </file>
 
+<file path=customXml/itemProps2.xml><?xml version="1.0" encoding="utf-8"?>
+<ds:datastoreItem xmlns:ds="http://schemas.openxmlformats.org/officeDocument/2006/customXml" ds:itemID="{23508F25-1CFF-4E55-9938-48AFE50A8977}">
+  <ds:schemaRefs>
+    <ds:schemaRef ds:uri="http://schemas.openxmlformats.org/officeDocument/2006/bibliography"/>
+  </ds:schemaRefs>
+</ds:datastoreItem>
+</file>
+
 <file path=customXml/itemProps3.xml><?xml version="1.0" encoding="utf-8"?>
+<ds:datastoreItem xmlns:ds="http://schemas.openxmlformats.org/officeDocument/2006/customXml" ds:itemID="{8A44BDE6-684E-4B5B-881D-4E5D5848FCED}">
+  <ds:schemaRefs>
+    <ds:schemaRef ds:uri="http://schemas.microsoft.com/sharepoint/v3/contenttype/forms"/>
+  </ds:schemaRefs>
+</ds:datastoreItem>
+</file>
+
+<file path=customXml/itemProps4.xml><?xml version="1.0" encoding="utf-8"?>
 <ds:datastoreItem xmlns:ds="http://schemas.openxmlformats.org/officeDocument/2006/customXml" ds:itemID="{1544F244-AEB7-488E-8A0B-2F69E695C909}">
   <ds:schemaRefs>
     <ds:schemaRef ds:uri="http://schemas.microsoft.com/office/2006/metadata/contentType"/>
@@ -14665,12 +14701,4 @@
     <ds:schemaRef ds:uri="http://schemas.microsoft.com/internal/obd"/>
   </ds:schemaRefs>
 </ds:datastoreItem>
-</file>
-
-<file path=customXml/itemProps4.xml><?xml version="1.0" encoding="utf-8"?>
-<ds:datastoreItem xmlns:ds="http://schemas.openxmlformats.org/officeDocument/2006/customXml" ds:itemID="{8A44BDE6-684E-4B5B-881D-4E5D5848FCED}">
-  <ds:schemaRefs>
-    <ds:schemaRef ds:uri="http://schemas.microsoft.com/sharepoint/v3/contenttype/forms"/>
-  </ds:schemaRefs>
-</ds:datastoreItem>
 </file>
</xml_diff>